<commit_message>
feat(staff,horse): add staff zone assignment API, stall query fixes, and English business rules
</commit_message>
<xml_diff>
--- a/Business_Rules_theo_Flow.docx
+++ b/Business_Rules_theo_Flow.docx
@@ -49,7 +49,7 @@
           <w:szCs w:val="22"/>
           <w:rFonts w:ascii="Times New Roman" w:cs="Times New Roman" w:eastAsia="Times New Roman" w:hAnsi="Times New Roman"/>
         </w:rPr>
-        <w:t xml:space="preserve">Tổng hợp từ Businessrule 1.docx, đối chiếu với 5 swimlane flow và hệ thống backend · Cập nhật 21/10/2026</w:t>
+        <w:t xml:space="preserve">Tổng hợp từ Businessrule 1.docx, đối chiếu với các swimlane flow và hệ thống backend · Cập nhật lần 2 – 21/10/2026</w:t>
       </w:r>
     </w:p>
     <w:p>
@@ -84,7 +84,7 @@
           <w:szCs w:val="22"/>
           <w:rFonts w:ascii="Times New Roman" w:cs="Times New Roman" w:eastAsia="Times New Roman" w:hAnsi="Times New Roman"/>
         </w:rPr>
-        <w:t xml:space="preserve">Mã mới: GEN-xx là rule chung; F1, F21, F22, F3, F4 tương ứng Flow 1, Flow 2.1, Flow 2.2, Flow 3, Flow 4.</w:t>
+        <w:t xml:space="preserve">Mã mới: GEN-xx là rule chung; F1, F21, F22, F3, F4, F5 tương ứng Flow 1, Flow 2.1, Flow 2.2, Flow 3, Flow 4 và Flow 5 (hóa đơn &amp; thanh toán).</w:t>
       </w:r>
     </w:p>
     <w:p>
@@ -102,7 +102,7 @@
           <w:szCs w:val="22"/>
           <w:rFonts w:ascii="Times New Roman" w:cs="Times New Roman" w:eastAsia="Times New Roman" w:hAnsi="Times New Roman"/>
         </w:rPr>
-        <w:t xml:space="preserve">Mã cũ: mã rule tương ứng trong Businessrule 1.docx; "(mới)" là rule bổ sung theo SRS hoặc ràng buộc của hệ thống.</w:t>
+        <w:t xml:space="preserve">Mã cũ: mã rule tương ứng trong Businessrule 1.docx; "(mới)" là rule bổ sung theo SRS hoặc theo quyết định của nhóm trong quá trình phát triển.</w:t>
       </w:r>
     </w:p>
     <w:p>
@@ -120,7 +120,7 @@
           <w:szCs w:val="22"/>
           <w:rFonts w:ascii="Times New Roman" w:cs="Times New Roman" w:eastAsia="Times New Roman" w:hAnsi="Times New Roman"/>
         </w:rPr>
-        <w:t xml:space="preserve">Trạng thái: mức độ backend đã áp dụng rule. Đã áp dụng: 32 · Một phần: 1 · Chưa áp dụng: 4 (tổng 37 rule).</w:t>
+        <w:t xml:space="preserve">Trạng thái: mức độ backend đã áp dụng rule. Đã áp dụng: 43 · Một phần: 2 · Chưa áp dụng: 3 (tổng 48 rule).</w:t>
       </w:r>
     </w:p>
     <w:p>
@@ -137,7 +137,114 @@
           <w:szCs w:val="30"/>
           <w:rFonts w:ascii="Times New Roman" w:cs="Times New Roman" w:eastAsia="Times New Roman" w:hAnsi="Times New Roman"/>
         </w:rPr>
-        <w:t xml:space="preserve">2. Business rule theo flow</w:t>
+        <w:t xml:space="preserve">2. Thay đổi so với bản trước</w:t>
+      </w:r>
+    </w:p>
+    <w:p>
+      <w:pPr>
+        <w:pStyle w:val="ListParagraph"/>
+        <w:numPr>
+          <w:ilvl w:val="0"/>
+          <w:numId w:val="1"/>
+        </w:numPr>
+        <w:spacing w:after="60"/>
+      </w:pPr>
+      <w:r>
+        <w:rPr>
+          <w:sz w:val="22"/>
+          <w:szCs w:val="22"/>
+          <w:rFonts w:ascii="Times New Roman" w:cs="Times New Roman" w:eastAsia="Times New Roman" w:hAnsi="Times New Roman"/>
+        </w:rPr>
+        <w:t xml:space="preserve">Thêm F21-06: Club Manager phân công HLV phụ trách ngựa; HLV chỉ xem và thao tác trên ngựa của mình (GEN-06 mở rộng).</w:t>
+      </w:r>
+    </w:p>
+    <w:p>
+      <w:pPr>
+        <w:pStyle w:val="ListParagraph"/>
+        <w:numPr>
+          <w:ilvl w:val="0"/>
+          <w:numId w:val="1"/>
+        </w:numPr>
+        <w:spacing w:after="60"/>
+      </w:pPr>
+      <w:r>
+        <w:rPr>
+          <w:sz w:val="22"/>
+          <w:szCs w:val="22"/>
+          <w:rFonts w:ascii="Times New Roman" w:cs="Times New Roman" w:eastAsia="Times New Roman" w:hAnsi="Times New Roman"/>
+        </w:rPr>
+        <w:t xml:space="preserve">Thêm F21-07 và F22-06: giáo án mới ở trạng thái Đang chờ; Groom xác nhận buổi tập và tới ngày bắt đầu thì giáo án mới Đang chạy.</w:t>
+      </w:r>
+    </w:p>
+    <w:p>
+      <w:pPr>
+        <w:pStyle w:val="ListParagraph"/>
+        <w:numPr>
+          <w:ilvl w:val="0"/>
+          <w:numId w:val="1"/>
+        </w:numPr>
+        <w:spacing w:after="60"/>
+      </w:pPr>
+      <w:r>
+        <w:rPr>
+          <w:sz w:val="22"/>
+          <w:szCs w:val="22"/>
+          <w:rFonts w:ascii="Times New Roman" w:cs="Times New Roman" w:eastAsia="Times New Roman" w:hAnsi="Times New Roman"/>
+        </w:rPr>
+        <w:t xml:space="preserve">Sửa F3-03: VetLock hủy cả buổi đã xác nhận; mở khóa thì giáo án về Đang chờ.</w:t>
+      </w:r>
+    </w:p>
+    <w:p>
+      <w:pPr>
+        <w:pStyle w:val="ListParagraph"/>
+        <w:numPr>
+          <w:ilvl w:val="0"/>
+          <w:numId w:val="1"/>
+        </w:numPr>
+        <w:spacing w:after="60"/>
+      </w:pPr>
+      <w:r>
+        <w:rPr>
+          <w:sz w:val="22"/>
+          <w:szCs w:val="22"/>
+          <w:rFonts w:ascii="Times New Roman" w:cs="Times New Roman" w:eastAsia="Times New Roman" w:hAnsi="Times New Roman"/>
+        </w:rPr>
+        <w:t xml:space="preserve">F3-07, F3-08 (BR_16, BR_17) chuyển sang Đã áp dụng: thanh toán phác đồ theo từng giai đoạn, ngoại lệ ca cấp cứu.</w:t>
+      </w:r>
+    </w:p>
+    <w:p>
+      <w:pPr>
+        <w:pStyle w:val="ListParagraph"/>
+        <w:numPr>
+          <w:ilvl w:val="0"/>
+          <w:numId w:val="1"/>
+        </w:numPr>
+        <w:spacing w:after="60"/>
+      </w:pPr>
+      <w:r>
+        <w:rPr>
+          <w:sz w:val="22"/>
+          <w:szCs w:val="22"/>
+          <w:rFonts w:ascii="Times New Roman" w:cs="Times New Roman" w:eastAsia="Times New Roman" w:hAnsi="Times New Roman"/>
+        </w:rPr>
+        <w:t xml:space="preserve">Thêm Flow 5 cho BR_11 – BR_15: hóa đơn tháng, phí trễ hạn, đình chỉ / kích hoạt lại, thanh toán VNPay Sandbox, báo cáo tài chính.</w:t>
+      </w:r>
+    </w:p>
+    <w:p>
+      <w:pPr>
+        <w:pStyle w:val="Heading1"/>
+        <w:spacing w:before="240" w:after="120"/>
+      </w:pPr>
+      <w:r>
+        <w:rPr>
+          <w:b/>
+          <w:bCs/>
+          <w:color w:val="1F3864"/>
+          <w:sz w:val="30"/>
+          <w:szCs w:val="30"/>
+          <w:rFonts w:ascii="Times New Roman" w:cs="Times New Roman" w:eastAsia="Times New Roman" w:hAnsi="Times New Roman"/>
+        </w:rPr>
+        <w:t xml:space="preserve">3. Business rule theo flow</w:t>
       </w:r>
     </w:p>
     <w:p>
@@ -154,7 +261,7 @@
           <w:szCs w:val="26"/>
           <w:rFonts w:ascii="Times New Roman" w:cs="Times New Roman" w:eastAsia="Times New Roman" w:hAnsi="Times New Roman"/>
         </w:rPr>
-        <w:t xml:space="preserve">2.1. Nhóm chung: Tài khoản &amp; bảo mật (áp dụng cho mọi flow)</w:t>
+        <w:t xml:space="preserve">3.1. Nhóm chung: Tài khoản, bảo mật &amp; phạm vi dữ liệu (áp dụng cho mọi flow)</w:t>
       </w:r>
     </w:p>
     <w:tbl>
@@ -799,7 +906,7 @@
                 <w:szCs w:val="22"/>
                 <w:rFonts w:ascii="Times New Roman" w:cs="Times New Roman" w:eastAsia="Times New Roman" w:hAnsi="Times New Roman"/>
               </w:rPr>
-              <w:t xml:space="preserve">Mã OTP (quên mật khẩu / đổi mật khẩu) gồm 6 chữ số, hiệu lực 5 phút, chỉ dùng một lần; yêu cầu mã mới thì mã cũ mất hiệu lực.</w:t>
+              <w:t xml:space="preserve">Mã OTP (quên mật khẩu / đổi mật khẩu) gồm 6 chữ số, hiệu lực 5 phút, chỉ dùng một lần, sai tối đa 5 lần; yêu cầu mã mới thì mã cũ mất hiệu lực.</w:t>
             </w:r>
           </w:p>
         </w:tc>
@@ -910,7 +1017,7 @@
                 <w:szCs w:val="22"/>
                 <w:rFonts w:ascii="Times New Roman" w:cs="Times New Roman" w:eastAsia="Times New Roman" w:hAnsi="Times New Roman"/>
               </w:rPr>
-              <w:t xml:space="preserve">Phân quyền dữ liệu: chủ ngựa chỉ xem được ngựa của mình; nhân viên chỉ thao tác trong phạm vi vai trò được giao.</w:t>
+              <w:t xml:space="preserve">Phân quyền dữ liệu: chủ ngựa chỉ xem được ngựa, hóa đơn và giao dịch của mình; Trainer chỉ xem và thao tác trên ngựa được Club Manager phân công (F21-06); Groom chỉ thao tác trong khu chuồng mình phụ trách.</w:t>
             </w:r>
           </w:p>
         </w:tc>
@@ -1021,7 +1128,7 @@
                 <w:szCs w:val="22"/>
                 <w:rFonts w:ascii="Times New Roman" w:cs="Times New Roman" w:eastAsia="Times New Roman" w:hAnsi="Times New Roman"/>
               </w:rPr>
-              <w:t xml:space="preserve">Mọi thao tác tạo, sửa, xóa dữ liệu trọng yếu và khóa / mở khóa an toàn đều được ghi vào Audit Log (người thực hiện, thời điểm, IP, giá trị cũ và mới).</w:t>
+              <w:t xml:space="preserve">Mọi thao tác tạo, sửa, xóa dữ liệu trọng yếu, khóa / mở khóa an toàn, quyết định duyệt, phân công HLV, thanh toán, đình chỉ / kích hoạt lại dịch vụ và tạm dừng phác đồ đều được ghi vào Audit Log (người thực hiện, thời điểm, IP, giá trị cũ và mới).</w:t>
             </w:r>
           </w:p>
         </w:tc>
@@ -1076,7 +1183,7 @@
                 <w:szCs w:val="22"/>
                 <w:rFonts w:ascii="Times New Roman" w:cs="Times New Roman" w:eastAsia="Times New Roman" w:hAnsi="Times New Roman"/>
               </w:rPr>
-              <w:t xml:space="preserve">Một phần (chưa ghi cho điều chỉnh kho, phác đồ)</w:t>
+              <w:t xml:space="preserve">Một phần (chưa ghi cho điều chỉnh kho)</w:t>
             </w:r>
           </w:p>
         </w:tc>
@@ -1101,7 +1208,7 @@
           <w:szCs w:val="26"/>
           <w:rFonts w:ascii="Times New Roman" w:cs="Times New Roman" w:eastAsia="Times New Roman" w:hAnsi="Times New Roman"/>
         </w:rPr>
-        <w:t xml:space="preserve">2.2. Flow 1: Hồ sơ &amp; lý lịch ngựa</w:t>
+        <w:t xml:space="preserve">3.2. Flow 1: Hồ sơ &amp; lý lịch ngựa</w:t>
       </w:r>
     </w:p>
     <w:tbl>
@@ -1937,7 +2044,7 @@
           <w:szCs w:val="26"/>
           <w:rFonts w:ascii="Times New Roman" w:cs="Times New Roman" w:eastAsia="Times New Roman" w:hAnsi="Times New Roman"/>
         </w:rPr>
-        <w:t xml:space="preserve">2.3. Flow 2.1: Xây dựng giáo án &amp; phân công huấn luyện</w:t>
+        <w:t xml:space="preserve">3.3. Flow 2.1: Xây dựng giáo án &amp; phân công huấn luyện</w:t>
       </w:r>
     </w:p>
     <w:tbl>
@@ -2138,7 +2245,7 @@
                 <w:szCs w:val="22"/>
                 <w:rFonts w:ascii="Times New Roman" w:cs="Times New Roman" w:eastAsia="Times New Roman" w:hAnsi="Times New Roman"/>
               </w:rPr>
-              <w:t xml:space="preserve">Chỉ lập giáo án cho ngựa đã được duyệt, đã có chuồng và không đang bị VetLock. Mỗi ngựa chỉ có một giáo án đang hoạt động (ACTIVE hoặc PAUSED).</w:t>
+              <w:t xml:space="preserve">Chỉ lập giáo án cho ngựa đã được duyệt, đã có chuồng và không đang bị VetLock. Mỗi ngựa chỉ có một giáo án chưa kết thúc (Đang chờ, Đang chạy hoặc Tạm dừng).</w:t>
             </w:r>
           </w:p>
         </w:tc>
@@ -2582,7 +2689,7 @@
                 <w:szCs w:val="22"/>
                 <w:rFonts w:ascii="Times New Roman" w:cs="Times New Roman" w:eastAsia="Times New Roman" w:hAnsi="Times New Roman"/>
               </w:rPr>
-              <w:t xml:space="preserve">Một Groom không được có hai buổi tập trùng khung giờ (mặc định mỗi buổi 60 phút).</w:t>
+              <w:t xml:space="preserve">Một Groom không được có hai buổi tập trùng khung giờ (mặc định mỗi buổi 60 phút); tính cả buổi đang chờ xác nhận và đã xác nhận.</w:t>
             </w:r>
           </w:p>
         </w:tc>
@@ -2610,6 +2717,228 @@
                 <w:rFonts w:ascii="Times New Roman" w:cs="Times New Roman" w:eastAsia="Times New Roman" w:hAnsi="Times New Roman"/>
               </w:rPr>
               <w:t xml:space="preserve">BR34</w:t>
+            </w:r>
+          </w:p>
+        </w:tc>
+        <w:tc>
+          <w:tcPr>
+            <w:tcW w:type="pct" w:w="17%"/>
+            <w:tcBorders>
+              <w:top w:val="single" w:color="8EAADB" w:sz="4"/>
+              <w:left w:val="single" w:color="8EAADB" w:sz="4"/>
+              <w:bottom w:val="single" w:color="8EAADB" w:sz="4"/>
+              <w:right w:val="single" w:color="8EAADB" w:sz="4"/>
+            </w:tcBorders>
+            <w:shd w:fill="E2F0D9" w:color="auto" w:val="clear"/>
+            <w:tcMar>
+              <w:top w:type="dxa" w:w="60"/>
+              <w:left w:type="dxa" w:w="100"/>
+              <w:bottom w:type="dxa" w:w="60"/>
+              <w:right w:type="dxa" w:w="100"/>
+            </w:tcMar>
+          </w:tcPr>
+          <w:p>
+            <w:r>
+              <w:rPr>
+                <w:sz w:val="22"/>
+                <w:szCs w:val="22"/>
+                <w:rFonts w:ascii="Times New Roman" w:cs="Times New Roman" w:eastAsia="Times New Roman" w:hAnsi="Times New Roman"/>
+              </w:rPr>
+              <w:t xml:space="preserve">Đã áp dụng</w:t>
+            </w:r>
+          </w:p>
+        </w:tc>
+      </w:tr>
+      <w:tr>
+        <w:tc>
+          <w:tcPr>
+            <w:tcW w:type="pct" w:w="9%"/>
+            <w:tcBorders>
+              <w:top w:val="single" w:color="8EAADB" w:sz="4"/>
+              <w:left w:val="single" w:color="8EAADB" w:sz="4"/>
+              <w:bottom w:val="single" w:color="8EAADB" w:sz="4"/>
+              <w:right w:val="single" w:color="8EAADB" w:sz="4"/>
+            </w:tcBorders>
+            <w:tcMar>
+              <w:top w:type="dxa" w:w="60"/>
+              <w:left w:type="dxa" w:w="100"/>
+              <w:bottom w:type="dxa" w:w="60"/>
+              <w:right w:type="dxa" w:w="100"/>
+            </w:tcMar>
+          </w:tcPr>
+          <w:p>
+            <w:r>
+              <w:rPr>
+                <w:sz w:val="22"/>
+                <w:szCs w:val="22"/>
+                <w:rFonts w:ascii="Times New Roman" w:cs="Times New Roman" w:eastAsia="Times New Roman" w:hAnsi="Times New Roman"/>
+              </w:rPr>
+              <w:t xml:space="preserve">F21-06</w:t>
+            </w:r>
+          </w:p>
+        </w:tc>
+        <w:tc>
+          <w:tcPr>
+            <w:tcW w:type="pct" w:w="61%"/>
+            <w:tcBorders>
+              <w:top w:val="single" w:color="8EAADB" w:sz="4"/>
+              <w:left w:val="single" w:color="8EAADB" w:sz="4"/>
+              <w:bottom w:val="single" w:color="8EAADB" w:sz="4"/>
+              <w:right w:val="single" w:color="8EAADB" w:sz="4"/>
+            </w:tcBorders>
+            <w:tcMar>
+              <w:top w:type="dxa" w:w="60"/>
+              <w:left w:type="dxa" w:w="100"/>
+              <w:bottom w:type="dxa" w:w="60"/>
+              <w:right w:type="dxa" w:w="100"/>
+            </w:tcMar>
+          </w:tcPr>
+          <w:p>
+            <w:r>
+              <w:rPr>
+                <w:sz w:val="22"/>
+                <w:szCs w:val="22"/>
+                <w:rFonts w:ascii="Times New Roman" w:cs="Times New Roman" w:eastAsia="Times New Roman" w:hAnsi="Times New Roman"/>
+              </w:rPr>
+              <w:t xml:space="preserve">Club Manager phân công HLV phụ trách từng ngựa đã duyệt. HLV chỉ xem và lập giáo án, khẩu phần, việc chăm sóc, báo sự cố, khóa khẩn cấp cho ngựa được phân công. Đổi HLV thì các giáo án chưa kết thúc được bàn giao cho HLV mới.</w:t>
+            </w:r>
+          </w:p>
+        </w:tc>
+        <w:tc>
+          <w:tcPr>
+            <w:tcW w:type="pct" w:w="13%"/>
+            <w:tcBorders>
+              <w:top w:val="single" w:color="8EAADB" w:sz="4"/>
+              <w:left w:val="single" w:color="8EAADB" w:sz="4"/>
+              <w:bottom w:val="single" w:color="8EAADB" w:sz="4"/>
+              <w:right w:val="single" w:color="8EAADB" w:sz="4"/>
+            </w:tcBorders>
+            <w:tcMar>
+              <w:top w:type="dxa" w:w="60"/>
+              <w:left w:type="dxa" w:w="100"/>
+              <w:bottom w:type="dxa" w:w="60"/>
+              <w:right w:type="dxa" w:w="100"/>
+            </w:tcMar>
+          </w:tcPr>
+          <w:p>
+            <w:r>
+              <w:rPr>
+                <w:sz w:val="22"/>
+                <w:szCs w:val="22"/>
+                <w:rFonts w:ascii="Times New Roman" w:cs="Times New Roman" w:eastAsia="Times New Roman" w:hAnsi="Times New Roman"/>
+              </w:rPr>
+              <w:t xml:space="preserve">(mới)</w:t>
+            </w:r>
+          </w:p>
+        </w:tc>
+        <w:tc>
+          <w:tcPr>
+            <w:tcW w:type="pct" w:w="17%"/>
+            <w:tcBorders>
+              <w:top w:val="single" w:color="8EAADB" w:sz="4"/>
+              <w:left w:val="single" w:color="8EAADB" w:sz="4"/>
+              <w:bottom w:val="single" w:color="8EAADB" w:sz="4"/>
+              <w:right w:val="single" w:color="8EAADB" w:sz="4"/>
+            </w:tcBorders>
+            <w:shd w:fill="E2F0D9" w:color="auto" w:val="clear"/>
+            <w:tcMar>
+              <w:top w:type="dxa" w:w="60"/>
+              <w:left w:type="dxa" w:w="100"/>
+              <w:bottom w:type="dxa" w:w="60"/>
+              <w:right w:type="dxa" w:w="100"/>
+            </w:tcMar>
+          </w:tcPr>
+          <w:p>
+            <w:r>
+              <w:rPr>
+                <w:sz w:val="22"/>
+                <w:szCs w:val="22"/>
+                <w:rFonts w:ascii="Times New Roman" w:cs="Times New Roman" w:eastAsia="Times New Roman" w:hAnsi="Times New Roman"/>
+              </w:rPr>
+              <w:t xml:space="preserve">Đã áp dụng</w:t>
+            </w:r>
+          </w:p>
+        </w:tc>
+      </w:tr>
+      <w:tr>
+        <w:tc>
+          <w:tcPr>
+            <w:tcW w:type="pct" w:w="9%"/>
+            <w:tcBorders>
+              <w:top w:val="single" w:color="8EAADB" w:sz="4"/>
+              <w:left w:val="single" w:color="8EAADB" w:sz="4"/>
+              <w:bottom w:val="single" w:color="8EAADB" w:sz="4"/>
+              <w:right w:val="single" w:color="8EAADB" w:sz="4"/>
+            </w:tcBorders>
+            <w:tcMar>
+              <w:top w:type="dxa" w:w="60"/>
+              <w:left w:type="dxa" w:w="100"/>
+              <w:bottom w:type="dxa" w:w="60"/>
+              <w:right w:type="dxa" w:w="100"/>
+            </w:tcMar>
+          </w:tcPr>
+          <w:p>
+            <w:r>
+              <w:rPr>
+                <w:sz w:val="22"/>
+                <w:szCs w:val="22"/>
+                <w:rFonts w:ascii="Times New Roman" w:cs="Times New Roman" w:eastAsia="Times New Roman" w:hAnsi="Times New Roman"/>
+              </w:rPr>
+              <w:t xml:space="preserve">F21-07</w:t>
+            </w:r>
+          </w:p>
+        </w:tc>
+        <w:tc>
+          <w:tcPr>
+            <w:tcW w:type="pct" w:w="61%"/>
+            <w:tcBorders>
+              <w:top w:val="single" w:color="8EAADB" w:sz="4"/>
+              <w:left w:val="single" w:color="8EAADB" w:sz="4"/>
+              <w:bottom w:val="single" w:color="8EAADB" w:sz="4"/>
+              <w:right w:val="single" w:color="8EAADB" w:sz="4"/>
+            </w:tcBorders>
+            <w:tcMar>
+              <w:top w:type="dxa" w:w="60"/>
+              <w:left w:type="dxa" w:w="100"/>
+              <w:bottom w:type="dxa" w:w="60"/>
+              <w:right w:type="dxa" w:w="100"/>
+            </w:tcMar>
+          </w:tcPr>
+          <w:p>
+            <w:r>
+              <w:rPr>
+                <w:sz w:val="22"/>
+                <w:szCs w:val="22"/>
+                <w:rFonts w:ascii="Times New Roman" w:cs="Times New Roman" w:eastAsia="Times New Roman" w:hAnsi="Times New Roman"/>
+              </w:rPr>
+              <w:t xml:space="preserve">Giáo án mới lập ở trạng thái Đang chờ. Chỉ chuyển sang Đang chạy khi đã có ít nhất một buổi tập được Groom xác nhận VÀ đã tới ngày bắt đầu của giáo án; nếu Groom xác nhận trước ngày bắt đầu thì hệ thống tự chuyển đúng ngày.</w:t>
+            </w:r>
+          </w:p>
+        </w:tc>
+        <w:tc>
+          <w:tcPr>
+            <w:tcW w:type="pct" w:w="13%"/>
+            <w:tcBorders>
+              <w:top w:val="single" w:color="8EAADB" w:sz="4"/>
+              <w:left w:val="single" w:color="8EAADB" w:sz="4"/>
+              <w:bottom w:val="single" w:color="8EAADB" w:sz="4"/>
+              <w:right w:val="single" w:color="8EAADB" w:sz="4"/>
+            </w:tcBorders>
+            <w:tcMar>
+              <w:top w:type="dxa" w:w="60"/>
+              <w:left w:type="dxa" w:w="100"/>
+              <w:bottom w:type="dxa" w:w="60"/>
+              <w:right w:type="dxa" w:w="100"/>
+            </w:tcMar>
+          </w:tcPr>
+          <w:p>
+            <w:r>
+              <w:rPr>
+                <w:sz w:val="22"/>
+                <w:szCs w:val="22"/>
+                <w:rFonts w:ascii="Times New Roman" w:cs="Times New Roman" w:eastAsia="Times New Roman" w:hAnsi="Times New Roman"/>
+              </w:rPr>
+              <w:t xml:space="preserve">(mới)</w:t>
             </w:r>
           </w:p>
         </w:tc>
@@ -2662,7 +2991,7 @@
           <w:szCs w:val="26"/>
           <w:rFonts w:ascii="Times New Roman" w:cs="Times New Roman" w:eastAsia="Times New Roman" w:hAnsi="Times New Roman"/>
         </w:rPr>
-        <w:t xml:space="preserve">2.4. Flow 2.2: Quản lý quá trình huấn luyện &amp; đánh giá kết quả</w:t>
+        <w:t xml:space="preserve">3.4. Flow 2.2: Quản lý quá trình huấn luyện &amp; đánh giá kết quả</w:t>
       </w:r>
     </w:p>
     <w:tbl>
@@ -3367,6 +3696,117 @@
           </w:p>
         </w:tc>
       </w:tr>
+      <w:tr>
+        <w:tc>
+          <w:tcPr>
+            <w:tcW w:type="pct" w:w="9%"/>
+            <w:tcBorders>
+              <w:top w:val="single" w:color="8EAADB" w:sz="4"/>
+              <w:left w:val="single" w:color="8EAADB" w:sz="4"/>
+              <w:bottom w:val="single" w:color="8EAADB" w:sz="4"/>
+              <w:right w:val="single" w:color="8EAADB" w:sz="4"/>
+            </w:tcBorders>
+            <w:tcMar>
+              <w:top w:type="dxa" w:w="60"/>
+              <w:left w:type="dxa" w:w="100"/>
+              <w:bottom w:type="dxa" w:w="60"/>
+              <w:right w:type="dxa" w:w="100"/>
+            </w:tcMar>
+          </w:tcPr>
+          <w:p>
+            <w:r>
+              <w:rPr>
+                <w:sz w:val="22"/>
+                <w:szCs w:val="22"/>
+                <w:rFonts w:ascii="Times New Roman" w:cs="Times New Roman" w:eastAsia="Times New Roman" w:hAnsi="Times New Roman"/>
+              </w:rPr>
+              <w:t xml:space="preserve">F22-06</w:t>
+            </w:r>
+          </w:p>
+        </w:tc>
+        <w:tc>
+          <w:tcPr>
+            <w:tcW w:type="pct" w:w="61%"/>
+            <w:tcBorders>
+              <w:top w:val="single" w:color="8EAADB" w:sz="4"/>
+              <w:left w:val="single" w:color="8EAADB" w:sz="4"/>
+              <w:bottom w:val="single" w:color="8EAADB" w:sz="4"/>
+              <w:right w:val="single" w:color="8EAADB" w:sz="4"/>
+            </w:tcBorders>
+            <w:tcMar>
+              <w:top w:type="dxa" w:w="60"/>
+              <w:left w:type="dxa" w:w="100"/>
+              <w:bottom w:type="dxa" w:w="60"/>
+              <w:right w:type="dxa" w:w="100"/>
+            </w:tcMar>
+          </w:tcPr>
+          <w:p>
+            <w:r>
+              <w:rPr>
+                <w:sz w:val="22"/>
+                <w:szCs w:val="22"/>
+                <w:rFonts w:ascii="Times New Roman" w:cs="Times New Roman" w:eastAsia="Times New Roman" w:hAnsi="Times New Roman"/>
+              </w:rPr>
+              <w:t xml:space="preserve">Groom được phân công phải xác nhận buổi tập trước khi thực hiện; chỉ xác nhận được buổi chưa qua giờ và ngựa không bị VetLock. Chỉ hoàn thành buổi đã xác nhận khi giáo án Đang chạy. Hết buổi tập chưa kết thúc thì giáo án tự Hoàn thành.</w:t>
+            </w:r>
+          </w:p>
+        </w:tc>
+        <w:tc>
+          <w:tcPr>
+            <w:tcW w:type="pct" w:w="13%"/>
+            <w:tcBorders>
+              <w:top w:val="single" w:color="8EAADB" w:sz="4"/>
+              <w:left w:val="single" w:color="8EAADB" w:sz="4"/>
+              <w:bottom w:val="single" w:color="8EAADB" w:sz="4"/>
+              <w:right w:val="single" w:color="8EAADB" w:sz="4"/>
+            </w:tcBorders>
+            <w:tcMar>
+              <w:top w:type="dxa" w:w="60"/>
+              <w:left w:type="dxa" w:w="100"/>
+              <w:bottom w:type="dxa" w:w="60"/>
+              <w:right w:type="dxa" w:w="100"/>
+            </w:tcMar>
+          </w:tcPr>
+          <w:p>
+            <w:r>
+              <w:rPr>
+                <w:sz w:val="22"/>
+                <w:szCs w:val="22"/>
+                <w:rFonts w:ascii="Times New Roman" w:cs="Times New Roman" w:eastAsia="Times New Roman" w:hAnsi="Times New Roman"/>
+              </w:rPr>
+              <w:t xml:space="preserve">(mới)</w:t>
+            </w:r>
+          </w:p>
+        </w:tc>
+        <w:tc>
+          <w:tcPr>
+            <w:tcW w:type="pct" w:w="17%"/>
+            <w:tcBorders>
+              <w:top w:val="single" w:color="8EAADB" w:sz="4"/>
+              <w:left w:val="single" w:color="8EAADB" w:sz="4"/>
+              <w:bottom w:val="single" w:color="8EAADB" w:sz="4"/>
+              <w:right w:val="single" w:color="8EAADB" w:sz="4"/>
+            </w:tcBorders>
+            <w:shd w:fill="E2F0D9" w:color="auto" w:val="clear"/>
+            <w:tcMar>
+              <w:top w:type="dxa" w:w="60"/>
+              <w:left w:type="dxa" w:w="100"/>
+              <w:bottom w:type="dxa" w:w="60"/>
+              <w:right w:type="dxa" w:w="100"/>
+            </w:tcMar>
+          </w:tcPr>
+          <w:p>
+            <w:r>
+              <w:rPr>
+                <w:sz w:val="22"/>
+                <w:szCs w:val="22"/>
+                <w:rFonts w:ascii="Times New Roman" w:cs="Times New Roman" w:eastAsia="Times New Roman" w:hAnsi="Times New Roman"/>
+              </w:rPr>
+              <w:t xml:space="preserve">Đã áp dụng</w:t>
+            </w:r>
+          </w:p>
+        </w:tc>
+      </w:tr>
     </w:tbl>
     <w:p>
       <w:pPr>
@@ -3387,7 +3827,7 @@
           <w:szCs w:val="26"/>
           <w:rFonts w:ascii="Times New Roman" w:cs="Times New Roman" w:eastAsia="Times New Roman" w:hAnsi="Times New Roman"/>
         </w:rPr>
-        <w:t xml:space="preserve">2.5. Flow 3: Y tế &amp; xử lý chấn thương</w:t>
+        <w:t xml:space="preserve">3.5. Flow 3: Y tế &amp; xử lý chấn thương</w:t>
       </w:r>
     </w:p>
     <w:tbl>
@@ -3588,7 +4028,7 @@
                 <w:szCs w:val="22"/>
                 <w:rFonts w:ascii="Times New Roman" w:cs="Times New Roman" w:eastAsia="Times New Roman" w:hAnsi="Times New Roman"/>
               </w:rPr>
-              <w:t xml:space="preserve">Groom chỉ báo sự cố cho ngựa trong khu mình phụ trách; ca được chuyển vào hộp thư của bác sĩ thú y. Người báo xem được kết quả xử lý ca của chính mình.</w:t>
+              <w:t xml:space="preserve">Groom chỉ báo sự cố cho ngựa trong khu mình phụ trách; Trainer chỉ báo cho ngựa được phân công. Ca được chuyển vào hộp thư của bác sĩ thú y; người báo xem được kết quả xử lý ca của chính mình.</w:t>
             </w:r>
           </w:p>
         </w:tc>
@@ -3810,7 +4250,7 @@
                 <w:szCs w:val="22"/>
                 <w:rFonts w:ascii="Times New Roman" w:cs="Times New Roman" w:eastAsia="Times New Roman" w:hAnsi="Times New Roman"/>
               </w:rPr>
-              <w:t xml:space="preserve">Khi kích hoạt VetLock: các buổi tập đã lên lịch của ngựa tự động bị hủy, giáo án chuyển sang Tạm dừng (PAUSED), Trainer và chủ ngựa nhận thông báo. Khi bác sĩ mở khóa, giáo án trở lại Đang hoạt động.</w:t>
+              <w:t xml:space="preserve">Khi kích hoạt VetLock: mọi buổi tập chưa thực hiện của ngựa (đang chờ và đã xác nhận) tự động bị hủy, giáo án Đang chạy chuyển Tạm dừng, Trainer và chủ ngựa nhận thông báo. Khi bác sĩ mở khóa, giáo án về Đang chờ để HLV phân công lại buổi tập.</w:t>
             </w:r>
           </w:p>
         </w:tc>
@@ -4143,7 +4583,7 @@
                 <w:szCs w:val="22"/>
                 <w:rFonts w:ascii="Times New Roman" w:cs="Times New Roman" w:eastAsia="Times New Roman" w:hAnsi="Times New Roman"/>
               </w:rPr>
-              <w:t xml:space="preserve">Kho chỉ cấp thuốc sau khi bác sĩ xác nhận phương án của kho.</w:t>
+              <w:t xml:space="preserve">Kho chỉ cấp thuốc sau khi bác sĩ xác nhận phương án của kho và các giai đoạn tới hạn đã được thanh toán (F3-07).</w:t>
             </w:r>
           </w:p>
         </w:tc>
@@ -4254,7 +4694,7 @@
                 <w:szCs w:val="22"/>
                 <w:rFonts w:ascii="Times New Roman" w:cs="Times New Roman" w:eastAsia="Times New Roman" w:hAnsi="Times New Roman"/>
               </w:rPr>
-              <w:t xml:space="preserve">Đến ngày bắt đầu giai đoạn mới của phác đồ mà chủ ngựa chưa thanh toán chi phí giai đoạn đó thì phác đồ bị tạm dừng.</w:t>
+              <w:t xml:space="preserve">Khi bác sĩ xác nhận phác đồ, mỗi giai đoạn có thuốc được lập một hóa đơn riêng, hạn thanh toán là ngày bắt đầu giai đoạn. Tới ngày bắt đầu mà chưa thanh toán thì phác đồ chuyển Tạm dừng do chưa thanh toán: kho không cấp thuốc, bác sĩ không ghi tiến trình. Thanh toán được xác minh thì phác đồ tự tiếp tục. Phác đồ hủy hoặc thay thế thì hóa đơn giai đoạn chưa trả bị hủy.</w:t>
             </w:r>
           </w:p>
         </w:tc>
@@ -4294,22 +4734,22 @@
               <w:bottom w:val="single" w:color="8EAADB" w:sz="4"/>
               <w:right w:val="single" w:color="8EAADB" w:sz="4"/>
             </w:tcBorders>
-            <w:shd w:fill="F8D7DA" w:color="auto" w:val="clear"/>
-            <w:tcMar>
-              <w:top w:type="dxa" w:w="60"/>
-              <w:left w:type="dxa" w:w="100"/>
-              <w:bottom w:type="dxa" w:w="60"/>
-              <w:right w:type="dxa" w:w="100"/>
-            </w:tcMar>
-          </w:tcPr>
-          <w:p>
-            <w:r>
-              <w:rPr>
-                <w:sz w:val="22"/>
-                <w:szCs w:val="22"/>
-                <w:rFonts w:ascii="Times New Roman" w:cs="Times New Roman" w:eastAsia="Times New Roman" w:hAnsi="Times New Roman"/>
-              </w:rPr>
-              <w:t xml:space="preserve">Chưa áp dụng</w:t>
+            <w:shd w:fill="E2F0D9" w:color="auto" w:val="clear"/>
+            <w:tcMar>
+              <w:top w:type="dxa" w:w="60"/>
+              <w:left w:type="dxa" w:w="100"/>
+              <w:bottom w:type="dxa" w:w="60"/>
+              <w:right w:type="dxa" w:w="100"/>
+            </w:tcMar>
+          </w:tcPr>
+          <w:p>
+            <w:r>
+              <w:rPr>
+                <w:sz w:val="22"/>
+                <w:szCs w:val="22"/>
+                <w:rFonts w:ascii="Times New Roman" w:cs="Times New Roman" w:eastAsia="Times New Roman" w:hAnsi="Times New Roman"/>
+              </w:rPr>
+              <w:t xml:space="preserve">Đã áp dụng</w:t>
             </w:r>
           </w:p>
         </w:tc>
@@ -4365,7 +4805,7 @@
                 <w:szCs w:val="22"/>
                 <w:rFonts w:ascii="Times New Roman" w:cs="Times New Roman" w:eastAsia="Times New Roman" w:hAnsi="Times New Roman"/>
               </w:rPr>
-              <w:t xml:space="preserve">Ngoại lệ: ca cấp cứu (CRITICAL) được điều trị trước và không bị tạm dừng vì chưa thanh toán.</w:t>
+              <w:t xml:space="preserve">Ngoại lệ: phác đồ của ca cấp cứu (mức CRITICAL) vẫn được lập hóa đơn nhưng không bị tạm dừng vì chưa thanh toán.</w:t>
             </w:r>
           </w:p>
         </w:tc>
@@ -4405,22 +4845,22 @@
               <w:bottom w:val="single" w:color="8EAADB" w:sz="4"/>
               <w:right w:val="single" w:color="8EAADB" w:sz="4"/>
             </w:tcBorders>
-            <w:shd w:fill="F8D7DA" w:color="auto" w:val="clear"/>
-            <w:tcMar>
-              <w:top w:type="dxa" w:w="60"/>
-              <w:left w:type="dxa" w:w="100"/>
-              <w:bottom w:type="dxa" w:w="60"/>
-              <w:right w:type="dxa" w:w="100"/>
-            </w:tcMar>
-          </w:tcPr>
-          <w:p>
-            <w:r>
-              <w:rPr>
-                <w:sz w:val="22"/>
-                <w:szCs w:val="22"/>
-                <w:rFonts w:ascii="Times New Roman" w:cs="Times New Roman" w:eastAsia="Times New Roman" w:hAnsi="Times New Roman"/>
-              </w:rPr>
-              <w:t xml:space="preserve">Chưa áp dụng</w:t>
+            <w:shd w:fill="E2F0D9" w:color="auto" w:val="clear"/>
+            <w:tcMar>
+              <w:top w:type="dxa" w:w="60"/>
+              <w:left w:type="dxa" w:w="100"/>
+              <w:bottom w:type="dxa" w:w="60"/>
+              <w:right w:type="dxa" w:w="100"/>
+            </w:tcMar>
+          </w:tcPr>
+          <w:p>
+            <w:r>
+              <w:rPr>
+                <w:sz w:val="22"/>
+                <w:szCs w:val="22"/>
+                <w:rFonts w:ascii="Times New Roman" w:cs="Times New Roman" w:eastAsia="Times New Roman" w:hAnsi="Times New Roman"/>
+              </w:rPr>
+              <w:t xml:space="preserve">Đã áp dụng</w:t>
             </w:r>
           </w:p>
         </w:tc>
@@ -4445,7 +4885,7 @@
           <w:szCs w:val="26"/>
           <w:rFonts w:ascii="Times New Roman" w:cs="Times New Roman" w:eastAsia="Times New Roman" w:hAnsi="Times New Roman"/>
         </w:rPr>
-        <w:t xml:space="preserve">2.6. Flow 4: Chăm sóc chuồng trại &amp; dinh dưỡng</w:t>
+        <w:t xml:space="preserve">3.6. Flow 4: Chăm sóc chuồng trại &amp; dinh dưỡng</w:t>
       </w:r>
     </w:p>
     <w:tbl>
@@ -4646,7 +5086,7 @@
                 <w:szCs w:val="22"/>
                 <w:rFonts w:ascii="Times New Roman" w:cs="Times New Roman" w:eastAsia="Times New Roman" w:hAnsi="Times New Roman"/>
               </w:rPr>
-              <w:t xml:space="preserve">Ngựa khỏe thì Trainer lập khẩu phần dinh dưỡng; ngựa đang VetLock thì chỉ bác sĩ thú y được lập khẩu phần.</w:t>
+              <w:t xml:space="preserve">Ngựa khỏe thì Trainer (được phân công) lập khẩu phần dinh dưỡng; ngựa đang VetLock thì chỉ bác sĩ thú y được lập khẩu phần.</w:t>
             </w:r>
           </w:p>
         </w:tc>
@@ -4979,7 +5419,7 @@
                 <w:szCs w:val="22"/>
                 <w:rFonts w:ascii="Times New Roman" w:cs="Times New Roman" w:eastAsia="Times New Roman" w:hAnsi="Times New Roman"/>
               </w:rPr>
-              <w:t xml:space="preserve">Công việc chăm sóc chưa được đánh dấu hoàn thành sau 45 phút kể từ giờ hẹn thì hệ thống cảnh báo Club Manager.</w:t>
+              <w:t xml:space="preserve">Công việc chăm sóc chưa được đánh dấu hoàn thành sau 45 phút kể từ giờ hẹn thì hệ thống cảnh báo Club Manager (kiểm tra mỗi 5 phút, mỗi việc cảnh báo một lần).</w:t>
             </w:r>
           </w:p>
         </w:tc>
@@ -5257,6 +5697,1064 @@
                 <w:rFonts w:ascii="Times New Roman" w:cs="Times New Roman" w:eastAsia="Times New Roman" w:hAnsi="Times New Roman"/>
               </w:rPr>
               <w:t xml:space="preserve">Đã áp dụng</w:t>
+            </w:r>
+          </w:p>
+        </w:tc>
+      </w:tr>
+    </w:tbl>
+    <w:p>
+      <w:pPr>
+        <w:spacing w:after="120"/>
+      </w:pPr>
+    </w:p>
+    <w:p>
+      <w:pPr>
+        <w:pStyle w:val="Heading2"/>
+        <w:spacing w:before="240" w:after="120"/>
+      </w:pPr>
+      <w:r>
+        <w:rPr>
+          <w:b/>
+          <w:bCs/>
+          <w:color w:val="1F3864"/>
+          <w:sz w:val="26"/>
+          <w:szCs w:val="26"/>
+          <w:rFonts w:ascii="Times New Roman" w:cs="Times New Roman" w:eastAsia="Times New Roman" w:hAnsi="Times New Roman"/>
+        </w:rPr>
+        <w:t xml:space="preserve">3.7. Flow 5 (mới): Hóa đơn, thanh toán &amp; báo cáo tài chính</w:t>
+      </w:r>
+    </w:p>
+    <w:tbl>
+      <w:tblPr>
+        <w:tblW w:type="pct" w:w="100%"/>
+        <w:tblBorders>
+          <w:top w:val="single" w:color="auto" w:sz="4"/>
+          <w:left w:val="single" w:color="auto" w:sz="4"/>
+          <w:bottom w:val="single" w:color="auto" w:sz="4"/>
+          <w:right w:val="single" w:color="auto" w:sz="4"/>
+          <w:insideH w:val="single" w:color="auto" w:sz="4"/>
+          <w:insideV w:val="single" w:color="auto" w:sz="4"/>
+        </w:tblBorders>
+      </w:tblPr>
+      <w:tblGrid>
+        <w:gridCol w:w="100"/>
+        <w:gridCol w:w="100"/>
+        <w:gridCol w:w="100"/>
+        <w:gridCol w:w="100"/>
+      </w:tblGrid>
+      <w:tr>
+        <w:trPr>
+          <w:tblHeader/>
+        </w:trPr>
+        <w:tc>
+          <w:tcPr>
+            <w:tcW w:type="pct" w:w="9%"/>
+            <w:tcBorders>
+              <w:top w:val="single" w:color="8EAADB" w:sz="4"/>
+              <w:left w:val="single" w:color="8EAADB" w:sz="4"/>
+              <w:bottom w:val="single" w:color="8EAADB" w:sz="4"/>
+              <w:right w:val="single" w:color="8EAADB" w:sz="4"/>
+            </w:tcBorders>
+            <w:shd w:fill="1F3864" w:color="auto" w:val="clear"/>
+            <w:tcMar>
+              <w:top w:type="dxa" w:w="60"/>
+              <w:left w:type="dxa" w:w="100"/>
+              <w:bottom w:type="dxa" w:w="60"/>
+              <w:right w:type="dxa" w:w="100"/>
+            </w:tcMar>
+          </w:tcPr>
+          <w:p>
+            <w:r>
+              <w:rPr>
+                <w:b/>
+                <w:bCs/>
+                <w:color w:val="FFFFFF"/>
+                <w:sz w:val="22"/>
+                <w:szCs w:val="22"/>
+                <w:rFonts w:ascii="Times New Roman" w:cs="Times New Roman" w:eastAsia="Times New Roman" w:hAnsi="Times New Roman"/>
+              </w:rPr>
+              <w:t xml:space="preserve">Mã</w:t>
+            </w:r>
+          </w:p>
+        </w:tc>
+        <w:tc>
+          <w:tcPr>
+            <w:tcW w:type="pct" w:w="61%"/>
+            <w:tcBorders>
+              <w:top w:val="single" w:color="8EAADB" w:sz="4"/>
+              <w:left w:val="single" w:color="8EAADB" w:sz="4"/>
+              <w:bottom w:val="single" w:color="8EAADB" w:sz="4"/>
+              <w:right w:val="single" w:color="8EAADB" w:sz="4"/>
+            </w:tcBorders>
+            <w:shd w:fill="1F3864" w:color="auto" w:val="clear"/>
+            <w:tcMar>
+              <w:top w:type="dxa" w:w="60"/>
+              <w:left w:type="dxa" w:w="100"/>
+              <w:bottom w:type="dxa" w:w="60"/>
+              <w:right w:type="dxa" w:w="100"/>
+            </w:tcMar>
+          </w:tcPr>
+          <w:p>
+            <w:r>
+              <w:rPr>
+                <w:b/>
+                <w:bCs/>
+                <w:color w:val="FFFFFF"/>
+                <w:sz w:val="22"/>
+                <w:szCs w:val="22"/>
+                <w:rFonts w:ascii="Times New Roman" w:cs="Times New Roman" w:eastAsia="Times New Roman" w:hAnsi="Times New Roman"/>
+              </w:rPr>
+              <w:t xml:space="preserve">Nội dung business rule</w:t>
+            </w:r>
+          </w:p>
+        </w:tc>
+        <w:tc>
+          <w:tcPr>
+            <w:tcW w:type="pct" w:w="13%"/>
+            <w:tcBorders>
+              <w:top w:val="single" w:color="8EAADB" w:sz="4"/>
+              <w:left w:val="single" w:color="8EAADB" w:sz="4"/>
+              <w:bottom w:val="single" w:color="8EAADB" w:sz="4"/>
+              <w:right w:val="single" w:color="8EAADB" w:sz="4"/>
+            </w:tcBorders>
+            <w:shd w:fill="1F3864" w:color="auto" w:val="clear"/>
+            <w:tcMar>
+              <w:top w:type="dxa" w:w="60"/>
+              <w:left w:type="dxa" w:w="100"/>
+              <w:bottom w:type="dxa" w:w="60"/>
+              <w:right w:type="dxa" w:w="100"/>
+            </w:tcMar>
+          </w:tcPr>
+          <w:p>
+            <w:r>
+              <w:rPr>
+                <w:b/>
+                <w:bCs/>
+                <w:color w:val="FFFFFF"/>
+                <w:sz w:val="22"/>
+                <w:szCs w:val="22"/>
+                <w:rFonts w:ascii="Times New Roman" w:cs="Times New Roman" w:eastAsia="Times New Roman" w:hAnsi="Times New Roman"/>
+              </w:rPr>
+              <w:t xml:space="preserve">Mã cũ</w:t>
+            </w:r>
+          </w:p>
+        </w:tc>
+        <w:tc>
+          <w:tcPr>
+            <w:tcW w:type="pct" w:w="17%"/>
+            <w:tcBorders>
+              <w:top w:val="single" w:color="8EAADB" w:sz="4"/>
+              <w:left w:val="single" w:color="8EAADB" w:sz="4"/>
+              <w:bottom w:val="single" w:color="8EAADB" w:sz="4"/>
+              <w:right w:val="single" w:color="8EAADB" w:sz="4"/>
+            </w:tcBorders>
+            <w:shd w:fill="1F3864" w:color="auto" w:val="clear"/>
+            <w:tcMar>
+              <w:top w:type="dxa" w:w="60"/>
+              <w:left w:type="dxa" w:w="100"/>
+              <w:bottom w:type="dxa" w:w="60"/>
+              <w:right w:type="dxa" w:w="100"/>
+            </w:tcMar>
+          </w:tcPr>
+          <w:p>
+            <w:r>
+              <w:rPr>
+                <w:b/>
+                <w:bCs/>
+                <w:color w:val="FFFFFF"/>
+                <w:sz w:val="22"/>
+                <w:szCs w:val="22"/>
+                <w:rFonts w:ascii="Times New Roman" w:cs="Times New Roman" w:eastAsia="Times New Roman" w:hAnsi="Times New Roman"/>
+              </w:rPr>
+              <w:t xml:space="preserve">Trạng thái</w:t>
+            </w:r>
+          </w:p>
+        </w:tc>
+      </w:tr>
+      <w:tr>
+        <w:tc>
+          <w:tcPr>
+            <w:tcW w:type="pct" w:w="9%"/>
+            <w:tcBorders>
+              <w:top w:val="single" w:color="8EAADB" w:sz="4"/>
+              <w:left w:val="single" w:color="8EAADB" w:sz="4"/>
+              <w:bottom w:val="single" w:color="8EAADB" w:sz="4"/>
+              <w:right w:val="single" w:color="8EAADB" w:sz="4"/>
+            </w:tcBorders>
+            <w:tcMar>
+              <w:top w:type="dxa" w:w="60"/>
+              <w:left w:type="dxa" w:w="100"/>
+              <w:bottom w:type="dxa" w:w="60"/>
+              <w:right w:type="dxa" w:w="100"/>
+            </w:tcMar>
+          </w:tcPr>
+          <w:p>
+            <w:r>
+              <w:rPr>
+                <w:sz w:val="22"/>
+                <w:szCs w:val="22"/>
+                <w:rFonts w:ascii="Times New Roman" w:cs="Times New Roman" w:eastAsia="Times New Roman" w:hAnsi="Times New Roman"/>
+              </w:rPr>
+              <w:t xml:space="preserve">F5-01</w:t>
+            </w:r>
+          </w:p>
+        </w:tc>
+        <w:tc>
+          <w:tcPr>
+            <w:tcW w:type="pct" w:w="61%"/>
+            <w:tcBorders>
+              <w:top w:val="single" w:color="8EAADB" w:sz="4"/>
+              <w:left w:val="single" w:color="8EAADB" w:sz="4"/>
+              <w:bottom w:val="single" w:color="8EAADB" w:sz="4"/>
+              <w:right w:val="single" w:color="8EAADB" w:sz="4"/>
+            </w:tcBorders>
+            <w:tcMar>
+              <w:top w:type="dxa" w:w="60"/>
+              <w:left w:type="dxa" w:w="100"/>
+              <w:bottom w:type="dxa" w:w="60"/>
+              <w:right w:type="dxa" w:w="100"/>
+            </w:tcMar>
+          </w:tcPr>
+          <w:p>
+            <w:r>
+              <w:rPr>
+                <w:sz w:val="22"/>
+                <w:szCs w:val="22"/>
+                <w:rFonts w:ascii="Times New Roman" w:cs="Times New Roman" w:eastAsia="Times New Roman" w:hAnsi="Times New Roman"/>
+              </w:rPr>
+              <w:t xml:space="preserve">Ngày 1 hằng tháng hệ thống phát hành hóa đơn kỳ tháng trước cho từng ngựa đang ở CLB, hạn thanh toán ngày 10. Chi phí lấy từ dữ liệu thật: phí lưu chuồng, vật tư chăm sóc đã dùng, phí đăng ký và vận chuyển thi đấu. Mỗi ngựa một hóa đơn mỗi kỳ; không phát sinh phí thì không lập.</w:t>
+            </w:r>
+          </w:p>
+        </w:tc>
+        <w:tc>
+          <w:tcPr>
+            <w:tcW w:type="pct" w:w="13%"/>
+            <w:tcBorders>
+              <w:top w:val="single" w:color="8EAADB" w:sz="4"/>
+              <w:left w:val="single" w:color="8EAADB" w:sz="4"/>
+              <w:bottom w:val="single" w:color="8EAADB" w:sz="4"/>
+              <w:right w:val="single" w:color="8EAADB" w:sz="4"/>
+            </w:tcBorders>
+            <w:tcMar>
+              <w:top w:type="dxa" w:w="60"/>
+              <w:left w:type="dxa" w:w="100"/>
+              <w:bottom w:type="dxa" w:w="60"/>
+              <w:right w:type="dxa" w:w="100"/>
+            </w:tcMar>
+          </w:tcPr>
+          <w:p>
+            <w:r>
+              <w:rPr>
+                <w:sz w:val="22"/>
+                <w:szCs w:val="22"/>
+                <w:rFonts w:ascii="Times New Roman" w:cs="Times New Roman" w:eastAsia="Times New Roman" w:hAnsi="Times New Roman"/>
+              </w:rPr>
+              <w:t xml:space="preserve">BR_12</w:t>
+            </w:r>
+          </w:p>
+        </w:tc>
+        <w:tc>
+          <w:tcPr>
+            <w:tcW w:type="pct" w:w="17%"/>
+            <w:tcBorders>
+              <w:top w:val="single" w:color="8EAADB" w:sz="4"/>
+              <w:left w:val="single" w:color="8EAADB" w:sz="4"/>
+              <w:bottom w:val="single" w:color="8EAADB" w:sz="4"/>
+              <w:right w:val="single" w:color="8EAADB" w:sz="4"/>
+            </w:tcBorders>
+            <w:shd w:fill="E2F0D9" w:color="auto" w:val="clear"/>
+            <w:tcMar>
+              <w:top w:type="dxa" w:w="60"/>
+              <w:left w:type="dxa" w:w="100"/>
+              <w:bottom w:type="dxa" w:w="60"/>
+              <w:right w:type="dxa" w:w="100"/>
+            </w:tcMar>
+          </w:tcPr>
+          <w:p>
+            <w:r>
+              <w:rPr>
+                <w:sz w:val="22"/>
+                <w:szCs w:val="22"/>
+                <w:rFonts w:ascii="Times New Roman" w:cs="Times New Roman" w:eastAsia="Times New Roman" w:hAnsi="Times New Roman"/>
+              </w:rPr>
+              <w:t xml:space="preserve">Đã áp dụng</w:t>
+            </w:r>
+          </w:p>
+        </w:tc>
+      </w:tr>
+      <w:tr>
+        <w:tc>
+          <w:tcPr>
+            <w:tcW w:type="pct" w:w="9%"/>
+            <w:tcBorders>
+              <w:top w:val="single" w:color="8EAADB" w:sz="4"/>
+              <w:left w:val="single" w:color="8EAADB" w:sz="4"/>
+              <w:bottom w:val="single" w:color="8EAADB" w:sz="4"/>
+              <w:right w:val="single" w:color="8EAADB" w:sz="4"/>
+            </w:tcBorders>
+            <w:tcMar>
+              <w:top w:type="dxa" w:w="60"/>
+              <w:left w:type="dxa" w:w="100"/>
+              <w:bottom w:type="dxa" w:w="60"/>
+              <w:right w:type="dxa" w:w="100"/>
+            </w:tcMar>
+          </w:tcPr>
+          <w:p>
+            <w:r>
+              <w:rPr>
+                <w:sz w:val="22"/>
+                <w:szCs w:val="22"/>
+                <w:rFonts w:ascii="Times New Roman" w:cs="Times New Roman" w:eastAsia="Times New Roman" w:hAnsi="Times New Roman"/>
+              </w:rPr>
+              <w:t xml:space="preserve">F5-02</w:t>
+            </w:r>
+          </w:p>
+        </w:tc>
+        <w:tc>
+          <w:tcPr>
+            <w:tcW w:type="pct" w:w="61%"/>
+            <w:tcBorders>
+              <w:top w:val="single" w:color="8EAADB" w:sz="4"/>
+              <w:left w:val="single" w:color="8EAADB" w:sz="4"/>
+              <w:bottom w:val="single" w:color="8EAADB" w:sz="4"/>
+              <w:right w:val="single" w:color="8EAADB" w:sz="4"/>
+            </w:tcBorders>
+            <w:tcMar>
+              <w:top w:type="dxa" w:w="60"/>
+              <w:left w:type="dxa" w:w="100"/>
+              <w:bottom w:type="dxa" w:w="60"/>
+              <w:right w:type="dxa" w:w="100"/>
+            </w:tcMar>
+          </w:tcPr>
+          <w:p>
+            <w:r>
+              <w:rPr>
+                <w:sz w:val="22"/>
+                <w:szCs w:val="22"/>
+                <w:rFonts w:ascii="Times New Roman" w:cs="Times New Roman" w:eastAsia="Times New Roman" w:hAnsi="Times New Roman"/>
+              </w:rPr>
+              <w:t xml:space="preserve">Từ ngày sau hạn thanh toán, hóa đơn chuyển Quá hạn và tính phí trễ hạn = tiền gốc × 1% × số ngày quá hạn; chủ ngựa được thông báo.</w:t>
+            </w:r>
+          </w:p>
+        </w:tc>
+        <w:tc>
+          <w:tcPr>
+            <w:tcW w:type="pct" w:w="13%"/>
+            <w:tcBorders>
+              <w:top w:val="single" w:color="8EAADB" w:sz="4"/>
+              <w:left w:val="single" w:color="8EAADB" w:sz="4"/>
+              <w:bottom w:val="single" w:color="8EAADB" w:sz="4"/>
+              <w:right w:val="single" w:color="8EAADB" w:sz="4"/>
+            </w:tcBorders>
+            <w:tcMar>
+              <w:top w:type="dxa" w:w="60"/>
+              <w:left w:type="dxa" w:w="100"/>
+              <w:bottom w:type="dxa" w:w="60"/>
+              <w:right w:type="dxa" w:w="100"/>
+            </w:tcMar>
+          </w:tcPr>
+          <w:p>
+            <w:r>
+              <w:rPr>
+                <w:sz w:val="22"/>
+                <w:szCs w:val="22"/>
+                <w:rFonts w:ascii="Times New Roman" w:cs="Times New Roman" w:eastAsia="Times New Roman" w:hAnsi="Times New Roman"/>
+              </w:rPr>
+              <w:t xml:space="preserve">BR_12, BR_14</w:t>
+            </w:r>
+          </w:p>
+        </w:tc>
+        <w:tc>
+          <w:tcPr>
+            <w:tcW w:type="pct" w:w="17%"/>
+            <w:tcBorders>
+              <w:top w:val="single" w:color="8EAADB" w:sz="4"/>
+              <w:left w:val="single" w:color="8EAADB" w:sz="4"/>
+              <w:bottom w:val="single" w:color="8EAADB" w:sz="4"/>
+              <w:right w:val="single" w:color="8EAADB" w:sz="4"/>
+            </w:tcBorders>
+            <w:shd w:fill="E2F0D9" w:color="auto" w:val="clear"/>
+            <w:tcMar>
+              <w:top w:type="dxa" w:w="60"/>
+              <w:left w:type="dxa" w:w="100"/>
+              <w:bottom w:type="dxa" w:w="60"/>
+              <w:right w:type="dxa" w:w="100"/>
+            </w:tcMar>
+          </w:tcPr>
+          <w:p>
+            <w:r>
+              <w:rPr>
+                <w:sz w:val="22"/>
+                <w:szCs w:val="22"/>
+                <w:rFonts w:ascii="Times New Roman" w:cs="Times New Roman" w:eastAsia="Times New Roman" w:hAnsi="Times New Roman"/>
+              </w:rPr>
+              <w:t xml:space="preserve">Đã áp dụng</w:t>
+            </w:r>
+          </w:p>
+        </w:tc>
+      </w:tr>
+      <w:tr>
+        <w:tc>
+          <w:tcPr>
+            <w:tcW w:type="pct" w:w="9%"/>
+            <w:tcBorders>
+              <w:top w:val="single" w:color="8EAADB" w:sz="4"/>
+              <w:left w:val="single" w:color="8EAADB" w:sz="4"/>
+              <w:bottom w:val="single" w:color="8EAADB" w:sz="4"/>
+              <w:right w:val="single" w:color="8EAADB" w:sz="4"/>
+            </w:tcBorders>
+            <w:tcMar>
+              <w:top w:type="dxa" w:w="60"/>
+              <w:left w:type="dxa" w:w="100"/>
+              <w:bottom w:type="dxa" w:w="60"/>
+              <w:right w:type="dxa" w:w="100"/>
+            </w:tcMar>
+          </w:tcPr>
+          <w:p>
+            <w:r>
+              <w:rPr>
+                <w:sz w:val="22"/>
+                <w:szCs w:val="22"/>
+                <w:rFonts w:ascii="Times New Roman" w:cs="Times New Roman" w:eastAsia="Times New Roman" w:hAnsi="Times New Roman"/>
+              </w:rPr>
+              <w:t xml:space="preserve">F5-03</w:t>
+            </w:r>
+          </w:p>
+        </w:tc>
+        <w:tc>
+          <w:tcPr>
+            <w:tcW w:type="pct" w:w="61%"/>
+            <w:tcBorders>
+              <w:top w:val="single" w:color="8EAADB" w:sz="4"/>
+              <w:left w:val="single" w:color="8EAADB" w:sz="4"/>
+              <w:bottom w:val="single" w:color="8EAADB" w:sz="4"/>
+              <w:right w:val="single" w:color="8EAADB" w:sz="4"/>
+            </w:tcBorders>
+            <w:tcMar>
+              <w:top w:type="dxa" w:w="60"/>
+              <w:left w:type="dxa" w:w="100"/>
+              <w:bottom w:type="dxa" w:w="60"/>
+              <w:right w:type="dxa" w:w="100"/>
+            </w:tcMar>
+          </w:tcPr>
+          <w:p>
+            <w:r>
+              <w:rPr>
+                <w:sz w:val="22"/>
+                <w:szCs w:val="22"/>
+                <w:rFonts w:ascii="Times New Roman" w:cs="Times New Roman" w:eastAsia="Times New Roman" w:hAnsi="Times New Roman"/>
+              </w:rPr>
+              <w:t xml:space="preserve">Ngày thứ 20 kể từ phát hành: cảnh báo chủ ngựa. Từ ngày thứ 25 chưa thanh toán: Club Manager được đình chỉ dịch vụ (phải ghi lý do), hệ thống báo danh sách đủ điều kiện.</w:t>
+            </w:r>
+          </w:p>
+        </w:tc>
+        <w:tc>
+          <w:tcPr>
+            <w:tcW w:type="pct" w:w="13%"/>
+            <w:tcBorders>
+              <w:top w:val="single" w:color="8EAADB" w:sz="4"/>
+              <w:left w:val="single" w:color="8EAADB" w:sz="4"/>
+              <w:bottom w:val="single" w:color="8EAADB" w:sz="4"/>
+              <w:right w:val="single" w:color="8EAADB" w:sz="4"/>
+            </w:tcBorders>
+            <w:tcMar>
+              <w:top w:type="dxa" w:w="60"/>
+              <w:left w:type="dxa" w:w="100"/>
+              <w:bottom w:type="dxa" w:w="60"/>
+              <w:right w:type="dxa" w:w="100"/>
+            </w:tcMar>
+          </w:tcPr>
+          <w:p>
+            <w:r>
+              <w:rPr>
+                <w:sz w:val="22"/>
+                <w:szCs w:val="22"/>
+                <w:rFonts w:ascii="Times New Roman" w:cs="Times New Roman" w:eastAsia="Times New Roman" w:hAnsi="Times New Roman"/>
+              </w:rPr>
+              <w:t xml:space="preserve">BR_13</w:t>
+            </w:r>
+          </w:p>
+        </w:tc>
+        <w:tc>
+          <w:tcPr>
+            <w:tcW w:type="pct" w:w="17%"/>
+            <w:tcBorders>
+              <w:top w:val="single" w:color="8EAADB" w:sz="4"/>
+              <w:left w:val="single" w:color="8EAADB" w:sz="4"/>
+              <w:bottom w:val="single" w:color="8EAADB" w:sz="4"/>
+              <w:right w:val="single" w:color="8EAADB" w:sz="4"/>
+            </w:tcBorders>
+            <w:shd w:fill="E2F0D9" w:color="auto" w:val="clear"/>
+            <w:tcMar>
+              <w:top w:type="dxa" w:w="60"/>
+              <w:left w:type="dxa" w:w="100"/>
+              <w:bottom w:type="dxa" w:w="60"/>
+              <w:right w:type="dxa" w:w="100"/>
+            </w:tcMar>
+          </w:tcPr>
+          <w:p>
+            <w:r>
+              <w:rPr>
+                <w:sz w:val="22"/>
+                <w:szCs w:val="22"/>
+                <w:rFonts w:ascii="Times New Roman" w:cs="Times New Roman" w:eastAsia="Times New Roman" w:hAnsi="Times New Roman"/>
+              </w:rPr>
+              <w:t xml:space="preserve">Đã áp dụng</w:t>
+            </w:r>
+          </w:p>
+        </w:tc>
+      </w:tr>
+      <w:tr>
+        <w:tc>
+          <w:tcPr>
+            <w:tcW w:type="pct" w:w="9%"/>
+            <w:tcBorders>
+              <w:top w:val="single" w:color="8EAADB" w:sz="4"/>
+              <w:left w:val="single" w:color="8EAADB" w:sz="4"/>
+              <w:bottom w:val="single" w:color="8EAADB" w:sz="4"/>
+              <w:right w:val="single" w:color="8EAADB" w:sz="4"/>
+            </w:tcBorders>
+            <w:tcMar>
+              <w:top w:type="dxa" w:w="60"/>
+              <w:left w:type="dxa" w:w="100"/>
+              <w:bottom w:type="dxa" w:w="60"/>
+              <w:right w:type="dxa" w:w="100"/>
+            </w:tcMar>
+          </w:tcPr>
+          <w:p>
+            <w:r>
+              <w:rPr>
+                <w:sz w:val="22"/>
+                <w:szCs w:val="22"/>
+                <w:rFonts w:ascii="Times New Roman" w:cs="Times New Roman" w:eastAsia="Times New Roman" w:hAnsi="Times New Roman"/>
+              </w:rPr>
+              <w:t xml:space="preserve">F5-04</w:t>
+            </w:r>
+          </w:p>
+        </w:tc>
+        <w:tc>
+          <w:tcPr>
+            <w:tcW w:type="pct" w:w="61%"/>
+            <w:tcBorders>
+              <w:top w:val="single" w:color="8EAADB" w:sz="4"/>
+              <w:left w:val="single" w:color="8EAADB" w:sz="4"/>
+              <w:bottom w:val="single" w:color="8EAADB" w:sz="4"/>
+              <w:right w:val="single" w:color="8EAADB" w:sz="4"/>
+            </w:tcBorders>
+            <w:tcMar>
+              <w:top w:type="dxa" w:w="60"/>
+              <w:left w:type="dxa" w:w="100"/>
+              <w:bottom w:type="dxa" w:w="60"/>
+              <w:right w:type="dxa" w:w="100"/>
+            </w:tcMar>
+          </w:tcPr>
+          <w:p>
+            <w:r>
+              <w:rPr>
+                <w:sz w:val="22"/>
+                <w:szCs w:val="22"/>
+                <w:rFonts w:ascii="Times New Roman" w:cs="Times New Roman" w:eastAsia="Times New Roman" w:hAnsi="Times New Roman"/>
+              </w:rPr>
+              <w:t xml:space="preserve">Khôi phục dịch vụ: chủ ngựa phải thanh toán 100% qua cổng thanh toán, gồm gốc + phí trễ hạn + phí kích hoạt lại 3.000.000 VND. Sau khi giao dịch được xác minh, hợp đồng chuyển Chờ kích hoạt lại và Club Manager kích hoạt lại.</w:t>
+            </w:r>
+          </w:p>
+        </w:tc>
+        <w:tc>
+          <w:tcPr>
+            <w:tcW w:type="pct" w:w="13%"/>
+            <w:tcBorders>
+              <w:top w:val="single" w:color="8EAADB" w:sz="4"/>
+              <w:left w:val="single" w:color="8EAADB" w:sz="4"/>
+              <w:bottom w:val="single" w:color="8EAADB" w:sz="4"/>
+              <w:right w:val="single" w:color="8EAADB" w:sz="4"/>
+            </w:tcBorders>
+            <w:tcMar>
+              <w:top w:type="dxa" w:w="60"/>
+              <w:left w:type="dxa" w:w="100"/>
+              <w:bottom w:type="dxa" w:w="60"/>
+              <w:right w:type="dxa" w:w="100"/>
+            </w:tcMar>
+          </w:tcPr>
+          <w:p>
+            <w:r>
+              <w:rPr>
+                <w:sz w:val="22"/>
+                <w:szCs w:val="22"/>
+                <w:rFonts w:ascii="Times New Roman" w:cs="Times New Roman" w:eastAsia="Times New Roman" w:hAnsi="Times New Roman"/>
+              </w:rPr>
+              <w:t xml:space="preserve">BR_14</w:t>
+            </w:r>
+          </w:p>
+        </w:tc>
+        <w:tc>
+          <w:tcPr>
+            <w:tcW w:type="pct" w:w="17%"/>
+            <w:tcBorders>
+              <w:top w:val="single" w:color="8EAADB" w:sz="4"/>
+              <w:left w:val="single" w:color="8EAADB" w:sz="4"/>
+              <w:bottom w:val="single" w:color="8EAADB" w:sz="4"/>
+              <w:right w:val="single" w:color="8EAADB" w:sz="4"/>
+            </w:tcBorders>
+            <w:shd w:fill="E2F0D9" w:color="auto" w:val="clear"/>
+            <w:tcMar>
+              <w:top w:type="dxa" w:w="60"/>
+              <w:left w:type="dxa" w:w="100"/>
+              <w:bottom w:type="dxa" w:w="60"/>
+              <w:right w:type="dxa" w:w="100"/>
+            </w:tcMar>
+          </w:tcPr>
+          <w:p>
+            <w:r>
+              <w:rPr>
+                <w:sz w:val="22"/>
+                <w:szCs w:val="22"/>
+                <w:rFonts w:ascii="Times New Roman" w:cs="Times New Roman" w:eastAsia="Times New Roman" w:hAnsi="Times New Roman"/>
+              </w:rPr>
+              <w:t xml:space="preserve">Đã áp dụng</w:t>
+            </w:r>
+          </w:p>
+        </w:tc>
+      </w:tr>
+      <w:tr>
+        <w:tc>
+          <w:tcPr>
+            <w:tcW w:type="pct" w:w="9%"/>
+            <w:tcBorders>
+              <w:top w:val="single" w:color="8EAADB" w:sz="4"/>
+              <w:left w:val="single" w:color="8EAADB" w:sz="4"/>
+              <w:bottom w:val="single" w:color="8EAADB" w:sz="4"/>
+              <w:right w:val="single" w:color="8EAADB" w:sz="4"/>
+            </w:tcBorders>
+            <w:tcMar>
+              <w:top w:type="dxa" w:w="60"/>
+              <w:left w:type="dxa" w:w="100"/>
+              <w:bottom w:type="dxa" w:w="60"/>
+              <w:right w:type="dxa" w:w="100"/>
+            </w:tcMar>
+          </w:tcPr>
+          <w:p>
+            <w:r>
+              <w:rPr>
+                <w:sz w:val="22"/>
+                <w:szCs w:val="22"/>
+                <w:rFonts w:ascii="Times New Roman" w:cs="Times New Roman" w:eastAsia="Times New Roman" w:hAnsi="Times New Roman"/>
+              </w:rPr>
+              <w:t xml:space="preserve">F5-05</w:t>
+            </w:r>
+          </w:p>
+        </w:tc>
+        <w:tc>
+          <w:tcPr>
+            <w:tcW w:type="pct" w:w="61%"/>
+            <w:tcBorders>
+              <w:top w:val="single" w:color="8EAADB" w:sz="4"/>
+              <w:left w:val="single" w:color="8EAADB" w:sz="4"/>
+              <w:bottom w:val="single" w:color="8EAADB" w:sz="4"/>
+              <w:right w:val="single" w:color="8EAADB" w:sz="4"/>
+            </w:tcBorders>
+            <w:tcMar>
+              <w:top w:type="dxa" w:w="60"/>
+              <w:left w:type="dxa" w:w="100"/>
+              <w:bottom w:type="dxa" w:w="60"/>
+              <w:right w:type="dxa" w:w="100"/>
+            </w:tcMar>
+          </w:tcPr>
+          <w:p>
+            <w:r>
+              <w:rPr>
+                <w:sz w:val="22"/>
+                <w:szCs w:val="22"/>
+                <w:rFonts w:ascii="Times New Roman" w:cs="Times New Roman" w:eastAsia="Times New Roman" w:hAnsi="Times New Roman"/>
+              </w:rPr>
+              <w:t xml:space="preserve">Nợ quá hạn liên tục trên 60 ngày thì chấm dứt hợp đồng lưu trú.</w:t>
+            </w:r>
+          </w:p>
+        </w:tc>
+        <w:tc>
+          <w:tcPr>
+            <w:tcW w:type="pct" w:w="13%"/>
+            <w:tcBorders>
+              <w:top w:val="single" w:color="8EAADB" w:sz="4"/>
+              <w:left w:val="single" w:color="8EAADB" w:sz="4"/>
+              <w:bottom w:val="single" w:color="8EAADB" w:sz="4"/>
+              <w:right w:val="single" w:color="8EAADB" w:sz="4"/>
+            </w:tcBorders>
+            <w:tcMar>
+              <w:top w:type="dxa" w:w="60"/>
+              <w:left w:type="dxa" w:w="100"/>
+              <w:bottom w:type="dxa" w:w="60"/>
+              <w:right w:type="dxa" w:w="100"/>
+            </w:tcMar>
+          </w:tcPr>
+          <w:p>
+            <w:r>
+              <w:rPr>
+                <w:sz w:val="22"/>
+                <w:szCs w:val="22"/>
+                <w:rFonts w:ascii="Times New Roman" w:cs="Times New Roman" w:eastAsia="Times New Roman" w:hAnsi="Times New Roman"/>
+              </w:rPr>
+              <w:t xml:space="preserve">BR_15</w:t>
+            </w:r>
+          </w:p>
+        </w:tc>
+        <w:tc>
+          <w:tcPr>
+            <w:tcW w:type="pct" w:w="17%"/>
+            <w:tcBorders>
+              <w:top w:val="single" w:color="8EAADB" w:sz="4"/>
+              <w:left w:val="single" w:color="8EAADB" w:sz="4"/>
+              <w:bottom w:val="single" w:color="8EAADB" w:sz="4"/>
+              <w:right w:val="single" w:color="8EAADB" w:sz="4"/>
+            </w:tcBorders>
+            <w:shd w:fill="FFF2CC" w:color="auto" w:val="clear"/>
+            <w:tcMar>
+              <w:top w:type="dxa" w:w="60"/>
+              <w:left w:type="dxa" w:w="100"/>
+              <w:bottom w:type="dxa" w:w="60"/>
+              <w:right w:type="dxa" w:w="100"/>
+            </w:tcMar>
+          </w:tcPr>
+          <w:p>
+            <w:r>
+              <w:rPr>
+                <w:sz w:val="22"/>
+                <w:szCs w:val="22"/>
+                <w:rFonts w:ascii="Times New Roman" w:cs="Times New Roman" w:eastAsia="Times New Roman" w:hAnsi="Times New Roman"/>
+              </w:rPr>
+              <w:t xml:space="preserve">Một phần (mới gắn cờ, chưa tự chấm dứt)</w:t>
+            </w:r>
+          </w:p>
+        </w:tc>
+      </w:tr>
+      <w:tr>
+        <w:tc>
+          <w:tcPr>
+            <w:tcW w:type="pct" w:w="9%"/>
+            <w:tcBorders>
+              <w:top w:val="single" w:color="8EAADB" w:sz="4"/>
+              <w:left w:val="single" w:color="8EAADB" w:sz="4"/>
+              <w:bottom w:val="single" w:color="8EAADB" w:sz="4"/>
+              <w:right w:val="single" w:color="8EAADB" w:sz="4"/>
+            </w:tcBorders>
+            <w:tcMar>
+              <w:top w:type="dxa" w:w="60"/>
+              <w:left w:type="dxa" w:w="100"/>
+              <w:bottom w:type="dxa" w:w="60"/>
+              <w:right w:type="dxa" w:w="100"/>
+            </w:tcMar>
+          </w:tcPr>
+          <w:p>
+            <w:r>
+              <w:rPr>
+                <w:sz w:val="22"/>
+                <w:szCs w:val="22"/>
+                <w:rFonts w:ascii="Times New Roman" w:cs="Times New Roman" w:eastAsia="Times New Roman" w:hAnsi="Times New Roman"/>
+              </w:rPr>
+              <w:t xml:space="preserve">F5-06</w:t>
+            </w:r>
+          </w:p>
+        </w:tc>
+        <w:tc>
+          <w:tcPr>
+            <w:tcW w:type="pct" w:w="61%"/>
+            <w:tcBorders>
+              <w:top w:val="single" w:color="8EAADB" w:sz="4"/>
+              <w:left w:val="single" w:color="8EAADB" w:sz="4"/>
+              <w:bottom w:val="single" w:color="8EAADB" w:sz="4"/>
+              <w:right w:val="single" w:color="8EAADB" w:sz="4"/>
+            </w:tcBorders>
+            <w:tcMar>
+              <w:top w:type="dxa" w:w="60"/>
+              <w:left w:type="dxa" w:w="100"/>
+              <w:bottom w:type="dxa" w:w="60"/>
+              <w:right w:type="dxa" w:w="100"/>
+            </w:tcMar>
+          </w:tcPr>
+          <w:p>
+            <w:r>
+              <w:rPr>
+                <w:sz w:val="22"/>
+                <w:szCs w:val="22"/>
+                <w:rFonts w:ascii="Times New Roman" w:cs="Times New Roman" w:eastAsia="Times New Roman" w:hAnsi="Times New Roman"/>
+              </w:rPr>
+              <w:t xml:space="preserve">Thanh toán qua VNPay (môi trường Sandbox). Hóa đơn chỉ chuyển Đã thanh toán khi server xác minh với VNPay (IPN hoặc truy vấn giao dịch): đúng chữ ký, đúng mã giao dịch, đúng số tiền, xử lý một lần. Trang trả về của trình duyệt không tự đánh dấu đã thanh toán.</w:t>
+            </w:r>
+          </w:p>
+        </w:tc>
+        <w:tc>
+          <w:tcPr>
+            <w:tcW w:type="pct" w:w="13%"/>
+            <w:tcBorders>
+              <w:top w:val="single" w:color="8EAADB" w:sz="4"/>
+              <w:left w:val="single" w:color="8EAADB" w:sz="4"/>
+              <w:bottom w:val="single" w:color="8EAADB" w:sz="4"/>
+              <w:right w:val="single" w:color="8EAADB" w:sz="4"/>
+            </w:tcBorders>
+            <w:tcMar>
+              <w:top w:type="dxa" w:w="60"/>
+              <w:left w:type="dxa" w:w="100"/>
+              <w:bottom w:type="dxa" w:w="60"/>
+              <w:right w:type="dxa" w:w="100"/>
+            </w:tcMar>
+          </w:tcPr>
+          <w:p>
+            <w:r>
+              <w:rPr>
+                <w:sz w:val="22"/>
+                <w:szCs w:val="22"/>
+                <w:rFonts w:ascii="Times New Roman" w:cs="Times New Roman" w:eastAsia="Times New Roman" w:hAnsi="Times New Roman"/>
+              </w:rPr>
+              <w:t xml:space="preserve">BR_12 (SRS)</w:t>
+            </w:r>
+          </w:p>
+        </w:tc>
+        <w:tc>
+          <w:tcPr>
+            <w:tcW w:type="pct" w:w="17%"/>
+            <w:tcBorders>
+              <w:top w:val="single" w:color="8EAADB" w:sz="4"/>
+              <w:left w:val="single" w:color="8EAADB" w:sz="4"/>
+              <w:bottom w:val="single" w:color="8EAADB" w:sz="4"/>
+              <w:right w:val="single" w:color="8EAADB" w:sz="4"/>
+            </w:tcBorders>
+            <w:shd w:fill="E2F0D9" w:color="auto" w:val="clear"/>
+            <w:tcMar>
+              <w:top w:type="dxa" w:w="60"/>
+              <w:left w:type="dxa" w:w="100"/>
+              <w:bottom w:type="dxa" w:w="60"/>
+              <w:right w:type="dxa" w:w="100"/>
+            </w:tcMar>
+          </w:tcPr>
+          <w:p>
+            <w:r>
+              <w:rPr>
+                <w:sz w:val="22"/>
+                <w:szCs w:val="22"/>
+                <w:rFonts w:ascii="Times New Roman" w:cs="Times New Roman" w:eastAsia="Times New Roman" w:hAnsi="Times New Roman"/>
+              </w:rPr>
+              <w:t xml:space="preserve">Đã áp dụng</w:t>
+            </w:r>
+          </w:p>
+        </w:tc>
+      </w:tr>
+      <w:tr>
+        <w:tc>
+          <w:tcPr>
+            <w:tcW w:type="pct" w:w="9%"/>
+            <w:tcBorders>
+              <w:top w:val="single" w:color="8EAADB" w:sz="4"/>
+              <w:left w:val="single" w:color="8EAADB" w:sz="4"/>
+              <w:bottom w:val="single" w:color="8EAADB" w:sz="4"/>
+              <w:right w:val="single" w:color="8EAADB" w:sz="4"/>
+            </w:tcBorders>
+            <w:tcMar>
+              <w:top w:type="dxa" w:w="60"/>
+              <w:left w:type="dxa" w:w="100"/>
+              <w:bottom w:type="dxa" w:w="60"/>
+              <w:right w:type="dxa" w:w="100"/>
+            </w:tcMar>
+          </w:tcPr>
+          <w:p>
+            <w:r>
+              <w:rPr>
+                <w:sz w:val="22"/>
+                <w:szCs w:val="22"/>
+                <w:rFonts w:ascii="Times New Roman" w:cs="Times New Roman" w:eastAsia="Times New Roman" w:hAnsi="Times New Roman"/>
+              </w:rPr>
+              <w:t xml:space="preserve">F5-07</w:t>
+            </w:r>
+          </w:p>
+        </w:tc>
+        <w:tc>
+          <w:tcPr>
+            <w:tcW w:type="pct" w:w="61%"/>
+            <w:tcBorders>
+              <w:top w:val="single" w:color="8EAADB" w:sz="4"/>
+              <w:left w:val="single" w:color="8EAADB" w:sz="4"/>
+              <w:bottom w:val="single" w:color="8EAADB" w:sz="4"/>
+              <w:right w:val="single" w:color="8EAADB" w:sz="4"/>
+            </w:tcBorders>
+            <w:tcMar>
+              <w:top w:type="dxa" w:w="60"/>
+              <w:left w:type="dxa" w:w="100"/>
+              <w:bottom w:type="dxa" w:w="60"/>
+              <w:right w:type="dxa" w:w="100"/>
+            </w:tcMar>
+          </w:tcPr>
+          <w:p>
+            <w:r>
+              <w:rPr>
+                <w:sz w:val="22"/>
+                <w:szCs w:val="22"/>
+                <w:rFonts w:ascii="Times New Roman" w:cs="Times New Roman" w:eastAsia="Times New Roman" w:hAnsi="Times New Roman"/>
+              </w:rPr>
+              <w:t xml:space="preserve">Báo cáo tài chính cho Club Manager: phát hành và đã thu theo tháng, tỷ lệ thu, tuổi nợ, doanh thu theo dịch vụ, công nợ theo chủ ngựa, chi phí nhập hàng. Chỉ tính giao dịch đã được xác minh.</w:t>
+            </w:r>
+          </w:p>
+        </w:tc>
+        <w:tc>
+          <w:tcPr>
+            <w:tcW w:type="pct" w:w="13%"/>
+            <w:tcBorders>
+              <w:top w:val="single" w:color="8EAADB" w:sz="4"/>
+              <w:left w:val="single" w:color="8EAADB" w:sz="4"/>
+              <w:bottom w:val="single" w:color="8EAADB" w:sz="4"/>
+              <w:right w:val="single" w:color="8EAADB" w:sz="4"/>
+            </w:tcBorders>
+            <w:tcMar>
+              <w:top w:type="dxa" w:w="60"/>
+              <w:left w:type="dxa" w:w="100"/>
+              <w:bottom w:type="dxa" w:w="60"/>
+              <w:right w:type="dxa" w:w="100"/>
+            </w:tcMar>
+          </w:tcPr>
+          <w:p>
+            <w:r>
+              <w:rPr>
+                <w:sz w:val="22"/>
+                <w:szCs w:val="22"/>
+                <w:rFonts w:ascii="Times New Roman" w:cs="Times New Roman" w:eastAsia="Times New Roman" w:hAnsi="Times New Roman"/>
+              </w:rPr>
+              <w:t xml:space="preserve">(SRS)</w:t>
+            </w:r>
+          </w:p>
+        </w:tc>
+        <w:tc>
+          <w:tcPr>
+            <w:tcW w:type="pct" w:w="17%"/>
+            <w:tcBorders>
+              <w:top w:val="single" w:color="8EAADB" w:sz="4"/>
+              <w:left w:val="single" w:color="8EAADB" w:sz="4"/>
+              <w:bottom w:val="single" w:color="8EAADB" w:sz="4"/>
+              <w:right w:val="single" w:color="8EAADB" w:sz="4"/>
+            </w:tcBorders>
+            <w:shd w:fill="E2F0D9" w:color="auto" w:val="clear"/>
+            <w:tcMar>
+              <w:top w:type="dxa" w:w="60"/>
+              <w:left w:type="dxa" w:w="100"/>
+              <w:bottom w:type="dxa" w:w="60"/>
+              <w:right w:type="dxa" w:w="100"/>
+            </w:tcMar>
+          </w:tcPr>
+          <w:p>
+            <w:r>
+              <w:rPr>
+                <w:sz w:val="22"/>
+                <w:szCs w:val="22"/>
+                <w:rFonts w:ascii="Times New Roman" w:cs="Times New Roman" w:eastAsia="Times New Roman" w:hAnsi="Times New Roman"/>
+              </w:rPr>
+              <w:t xml:space="preserve">Đã áp dụng</w:t>
+            </w:r>
+          </w:p>
+        </w:tc>
+      </w:tr>
+      <w:tr>
+        <w:tc>
+          <w:tcPr>
+            <w:tcW w:type="pct" w:w="9%"/>
+            <w:tcBorders>
+              <w:top w:val="single" w:color="8EAADB" w:sz="4"/>
+              <w:left w:val="single" w:color="8EAADB" w:sz="4"/>
+              <w:bottom w:val="single" w:color="8EAADB" w:sz="4"/>
+              <w:right w:val="single" w:color="8EAADB" w:sz="4"/>
+            </w:tcBorders>
+            <w:tcMar>
+              <w:top w:type="dxa" w:w="60"/>
+              <w:left w:type="dxa" w:w="100"/>
+              <w:bottom w:type="dxa" w:w="60"/>
+              <w:right w:type="dxa" w:w="100"/>
+            </w:tcMar>
+          </w:tcPr>
+          <w:p>
+            <w:r>
+              <w:rPr>
+                <w:sz w:val="22"/>
+                <w:szCs w:val="22"/>
+                <w:rFonts w:ascii="Times New Roman" w:cs="Times New Roman" w:eastAsia="Times New Roman" w:hAnsi="Times New Roman"/>
+              </w:rPr>
+              <w:t xml:space="preserve">F5-08</w:t>
+            </w:r>
+          </w:p>
+        </w:tc>
+        <w:tc>
+          <w:tcPr>
+            <w:tcW w:type="pct" w:w="61%"/>
+            <w:tcBorders>
+              <w:top w:val="single" w:color="8EAADB" w:sz="4"/>
+              <w:left w:val="single" w:color="8EAADB" w:sz="4"/>
+              <w:bottom w:val="single" w:color="8EAADB" w:sz="4"/>
+              <w:right w:val="single" w:color="8EAADB" w:sz="4"/>
+            </w:tcBorders>
+            <w:tcMar>
+              <w:top w:type="dxa" w:w="60"/>
+              <w:left w:type="dxa" w:w="100"/>
+              <w:bottom w:type="dxa" w:w="60"/>
+              <w:right w:type="dxa" w:w="100"/>
+            </w:tcMar>
+          </w:tcPr>
+          <w:p>
+            <w:r>
+              <w:rPr>
+                <w:sz w:val="22"/>
+                <w:szCs w:val="22"/>
+                <w:rFonts w:ascii="Times New Roman" w:cs="Times New Roman" w:eastAsia="Times New Roman" w:hAnsi="Times New Roman"/>
+              </w:rPr>
+              <w:t xml:space="preserve">Tự động chia tiền thưởng giải đấu theo hợp đồng sở hữu và khấu trừ vào hóa đơn của chủ ngựa.</w:t>
+            </w:r>
+          </w:p>
+        </w:tc>
+        <w:tc>
+          <w:tcPr>
+            <w:tcW w:type="pct" w:w="13%"/>
+            <w:tcBorders>
+              <w:top w:val="single" w:color="8EAADB" w:sz="4"/>
+              <w:left w:val="single" w:color="8EAADB" w:sz="4"/>
+              <w:bottom w:val="single" w:color="8EAADB" w:sz="4"/>
+              <w:right w:val="single" w:color="8EAADB" w:sz="4"/>
+            </w:tcBorders>
+            <w:tcMar>
+              <w:top w:type="dxa" w:w="60"/>
+              <w:left w:type="dxa" w:w="100"/>
+              <w:bottom w:type="dxa" w:w="60"/>
+              <w:right w:type="dxa" w:w="100"/>
+            </w:tcMar>
+          </w:tcPr>
+          <w:p>
+            <w:r>
+              <w:rPr>
+                <w:sz w:val="22"/>
+                <w:szCs w:val="22"/>
+                <w:rFonts w:ascii="Times New Roman" w:cs="Times New Roman" w:eastAsia="Times New Roman" w:hAnsi="Times New Roman"/>
+              </w:rPr>
+              <w:t xml:space="preserve">BR_11</w:t>
+            </w:r>
+          </w:p>
+        </w:tc>
+        <w:tc>
+          <w:tcPr>
+            <w:tcW w:type="pct" w:w="17%"/>
+            <w:tcBorders>
+              <w:top w:val="single" w:color="8EAADB" w:sz="4"/>
+              <w:left w:val="single" w:color="8EAADB" w:sz="4"/>
+              <w:bottom w:val="single" w:color="8EAADB" w:sz="4"/>
+              <w:right w:val="single" w:color="8EAADB" w:sz="4"/>
+            </w:tcBorders>
+            <w:shd w:fill="F8D7DA" w:color="auto" w:val="clear"/>
+            <w:tcMar>
+              <w:top w:type="dxa" w:w="60"/>
+              <w:left w:type="dxa" w:w="100"/>
+              <w:bottom w:type="dxa" w:w="60"/>
+              <w:right w:type="dxa" w:w="100"/>
+            </w:tcMar>
+          </w:tcPr>
+          <w:p>
+            <w:r>
+              <w:rPr>
+                <w:sz w:val="22"/>
+                <w:szCs w:val="22"/>
+                <w:rFonts w:ascii="Times New Roman" w:cs="Times New Roman" w:eastAsia="Times New Roman" w:hAnsi="Times New Roman"/>
+              </w:rPr>
+              <w:t xml:space="preserve">Chưa áp dụng</w:t>
             </w:r>
           </w:p>
         </w:tc>
@@ -5281,7 +6779,7 @@
           <w:szCs w:val="30"/>
           <w:rFonts w:ascii="Times New Roman" w:cs="Times New Roman" w:eastAsia="Times New Roman" w:hAnsi="Times New Roman"/>
         </w:rPr>
-        <w:t xml:space="preserve">3. Rule ngoài 5 flow (phạm vi giai đoạn sau)</w:t>
+        <w:t xml:space="preserve">4. Rule ngoài các flow (phạm vi giai đoạn sau)</w:t>
       </w:r>
     </w:p>
     <w:tbl>
@@ -5477,173 +6975,7 @@
                 <w:szCs w:val="22"/>
                 <w:rFonts w:ascii="Times New Roman" w:cs="Times New Roman" w:eastAsia="Times New Roman" w:hAnsi="Times New Roman"/>
               </w:rPr>
-              <w:t xml:space="preserve">Cần thêm flow thi đấu</w:t>
-            </w:r>
-          </w:p>
-        </w:tc>
-      </w:tr>
-      <w:tr>
-        <w:tc>
-          <w:tcPr>
-            <w:tcW w:type="pct" w:w="16%"/>
-            <w:tcBorders>
-              <w:top w:val="single" w:color="8EAADB" w:sz="4"/>
-              <w:left w:val="single" w:color="8EAADB" w:sz="4"/>
-              <w:bottom w:val="single" w:color="8EAADB" w:sz="4"/>
-              <w:right w:val="single" w:color="8EAADB" w:sz="4"/>
-            </w:tcBorders>
-            <w:tcMar>
-              <w:top w:type="dxa" w:w="60"/>
-              <w:left w:type="dxa" w:w="100"/>
-              <w:bottom w:type="dxa" w:w="60"/>
-              <w:right w:type="dxa" w:w="100"/>
-            </w:tcMar>
-          </w:tcPr>
-          <w:p>
-            <w:r>
-              <w:rPr>
-                <w:sz w:val="22"/>
-                <w:szCs w:val="22"/>
-                <w:rFonts w:ascii="Times New Roman" w:cs="Times New Roman" w:eastAsia="Times New Roman" w:hAnsi="Times New Roman"/>
-              </w:rPr>
-              <w:t xml:space="preserve">BR_11</w:t>
-            </w:r>
-          </w:p>
-        </w:tc>
-        <w:tc>
-          <w:tcPr>
-            <w:tcW w:type="pct" w:w="54%"/>
-            <w:tcBorders>
-              <w:top w:val="single" w:color="8EAADB" w:sz="4"/>
-              <w:left w:val="single" w:color="8EAADB" w:sz="4"/>
-              <w:bottom w:val="single" w:color="8EAADB" w:sz="4"/>
-              <w:right w:val="single" w:color="8EAADB" w:sz="4"/>
-            </w:tcBorders>
-            <w:tcMar>
-              <w:top w:type="dxa" w:w="60"/>
-              <w:left w:type="dxa" w:w="100"/>
-              <w:bottom w:type="dxa" w:w="60"/>
-              <w:right w:type="dxa" w:w="100"/>
-            </w:tcMar>
-          </w:tcPr>
-          <w:p>
-            <w:r>
-              <w:rPr>
-                <w:sz w:val="22"/>
-                <w:szCs w:val="22"/>
-                <w:rFonts w:ascii="Times New Roman" w:cs="Times New Roman" w:eastAsia="Times New Roman" w:hAnsi="Times New Roman"/>
-              </w:rPr>
-              <w:t xml:space="preserve">Chia tiền thưởng giải đấu.</w:t>
-            </w:r>
-          </w:p>
-        </w:tc>
-        <w:tc>
-          <w:tcPr>
-            <w:tcW w:type="pct" w:w="30%"/>
-            <w:tcBorders>
-              <w:top w:val="single" w:color="8EAADB" w:sz="4"/>
-              <w:left w:val="single" w:color="8EAADB" w:sz="4"/>
-              <w:bottom w:val="single" w:color="8EAADB" w:sz="4"/>
-              <w:right w:val="single" w:color="8EAADB" w:sz="4"/>
-            </w:tcBorders>
-            <w:tcMar>
-              <w:top w:type="dxa" w:w="60"/>
-              <w:left w:type="dxa" w:w="100"/>
-              <w:bottom w:type="dxa" w:w="60"/>
-              <w:right w:type="dxa" w:w="100"/>
-            </w:tcMar>
-          </w:tcPr>
-          <w:p>
-            <w:r>
-              <w:rPr>
-                <w:sz w:val="22"/>
-                <w:szCs w:val="22"/>
-                <w:rFonts w:ascii="Times New Roman" w:cs="Times New Roman" w:eastAsia="Times New Roman" w:hAnsi="Times New Roman"/>
-              </w:rPr>
-              <w:t xml:space="preserve">Chưa có module</w:t>
-            </w:r>
-          </w:p>
-        </w:tc>
-      </w:tr>
-      <w:tr>
-        <w:tc>
-          <w:tcPr>
-            <w:tcW w:type="pct" w:w="16%"/>
-            <w:tcBorders>
-              <w:top w:val="single" w:color="8EAADB" w:sz="4"/>
-              <w:left w:val="single" w:color="8EAADB" w:sz="4"/>
-              <w:bottom w:val="single" w:color="8EAADB" w:sz="4"/>
-              <w:right w:val="single" w:color="8EAADB" w:sz="4"/>
-            </w:tcBorders>
-            <w:tcMar>
-              <w:top w:type="dxa" w:w="60"/>
-              <w:left w:type="dxa" w:w="100"/>
-              <w:bottom w:type="dxa" w:w="60"/>
-              <w:right w:type="dxa" w:w="100"/>
-            </w:tcMar>
-          </w:tcPr>
-          <w:p>
-            <w:r>
-              <w:rPr>
-                <w:sz w:val="22"/>
-                <w:szCs w:val="22"/>
-                <w:rFonts w:ascii="Times New Roman" w:cs="Times New Roman" w:eastAsia="Times New Roman" w:hAnsi="Times New Roman"/>
-              </w:rPr>
-              <w:t xml:space="preserve">BR_12 – BR_15</w:t>
-            </w:r>
-          </w:p>
-        </w:tc>
-        <w:tc>
-          <w:tcPr>
-            <w:tcW w:type="pct" w:w="54%"/>
-            <w:tcBorders>
-              <w:top w:val="single" w:color="8EAADB" w:sz="4"/>
-              <w:left w:val="single" w:color="8EAADB" w:sz="4"/>
-              <w:bottom w:val="single" w:color="8EAADB" w:sz="4"/>
-              <w:right w:val="single" w:color="8EAADB" w:sz="4"/>
-            </w:tcBorders>
-            <w:tcMar>
-              <w:top w:type="dxa" w:w="60"/>
-              <w:left w:type="dxa" w:w="100"/>
-              <w:bottom w:type="dxa" w:w="60"/>
-              <w:right w:type="dxa" w:w="100"/>
-            </w:tcMar>
-          </w:tcPr>
-          <w:p>
-            <w:r>
-              <w:rPr>
-                <w:sz w:val="22"/>
-                <w:szCs w:val="22"/>
-                <w:rFonts w:ascii="Times New Roman" w:cs="Times New Roman" w:eastAsia="Times New Roman" w:hAnsi="Times New Roman"/>
-              </w:rPr>
-              <w:t xml:space="preserve">Hóa đơn, ân hạn 10 ngày, đình chỉ dịch vụ sau 25 ngày, phí kích hoạt lại, chấm dứt hợp đồng sau 60 ngày.</w:t>
-            </w:r>
-          </w:p>
-        </w:tc>
-        <w:tc>
-          <w:tcPr>
-            <w:tcW w:type="pct" w:w="30%"/>
-            <w:tcBorders>
-              <w:top w:val="single" w:color="8EAADB" w:sz="4"/>
-              <w:left w:val="single" w:color="8EAADB" w:sz="4"/>
-              <w:bottom w:val="single" w:color="8EAADB" w:sz="4"/>
-              <w:right w:val="single" w:color="8EAADB" w:sz="4"/>
-            </w:tcBorders>
-            <w:tcMar>
-              <w:top w:type="dxa" w:w="60"/>
-              <w:left w:type="dxa" w:w="100"/>
-              <w:bottom w:type="dxa" w:w="60"/>
-              <w:right w:type="dxa" w:w="100"/>
-            </w:tcMar>
-          </w:tcPr>
-          <w:p>
-            <w:r>
-              <w:rPr>
-                <w:sz w:val="22"/>
-                <w:szCs w:val="22"/>
-                <w:rFonts w:ascii="Times New Roman" w:cs="Times New Roman" w:eastAsia="Times New Roman" w:hAnsi="Times New Roman"/>
-              </w:rPr>
-              <w:t xml:space="preserve">Cần thêm flow tài chính; nên ghi rõ mức phí trễ hạn trong BR_12</w:t>
+              <w:t xml:space="preserve">Cần thêm flow thi đấu; API khám trước đua hiện là dữ liệu giả</w:t>
             </w:r>
           </w:p>
         </w:tc>
@@ -5668,7 +7000,7 @@
           <w:szCs w:val="30"/>
           <w:rFonts w:ascii="Times New Roman" w:cs="Times New Roman" w:eastAsia="Times New Roman" w:hAnsi="Times New Roman"/>
         </w:rPr>
-        <w:t xml:space="preserve">4. Rule cũ đã gộp hoặc điều chỉnh</w:t>
+        <w:t xml:space="preserve">5. Rule cũ đã gộp hoặc điều chỉnh</w:t>
       </w:r>
     </w:p>
     <w:tbl>
@@ -6201,6 +7533,89 @@
           </w:p>
         </w:tc>
       </w:tr>
+      <w:tr>
+        <w:tc>
+          <w:tcPr>
+            <w:tcW w:type="pct" w:w="22%"/>
+            <w:tcBorders>
+              <w:top w:val="single" w:color="8EAADB" w:sz="4"/>
+              <w:left w:val="single" w:color="8EAADB" w:sz="4"/>
+              <w:bottom w:val="single" w:color="8EAADB" w:sz="4"/>
+              <w:right w:val="single" w:color="8EAADB" w:sz="4"/>
+            </w:tcBorders>
+            <w:tcMar>
+              <w:top w:type="dxa" w:w="60"/>
+              <w:left w:type="dxa" w:w="100"/>
+              <w:bottom w:type="dxa" w:w="60"/>
+              <w:right w:type="dxa" w:w="100"/>
+            </w:tcMar>
+          </w:tcPr>
+          <w:p>
+            <w:r>
+              <w:rPr>
+                <w:sz w:val="22"/>
+                <w:szCs w:val="22"/>
+                <w:rFonts w:ascii="Times New Roman" w:cs="Times New Roman" w:eastAsia="Times New Roman" w:hAnsi="Times New Roman"/>
+              </w:rPr>
+              <w:t xml:space="preserve">BR_11 – BR_15</w:t>
+            </w:r>
+          </w:p>
+        </w:tc>
+        <w:tc>
+          <w:tcPr>
+            <w:tcW w:type="pct" w:w="38%"/>
+            <w:tcBorders>
+              <w:top w:val="single" w:color="8EAADB" w:sz="4"/>
+              <w:left w:val="single" w:color="8EAADB" w:sz="4"/>
+              <w:bottom w:val="single" w:color="8EAADB" w:sz="4"/>
+              <w:right w:val="single" w:color="8EAADB" w:sz="4"/>
+            </w:tcBorders>
+            <w:tcMar>
+              <w:top w:type="dxa" w:w="60"/>
+              <w:left w:type="dxa" w:w="100"/>
+              <w:bottom w:type="dxa" w:w="60"/>
+              <w:right w:type="dxa" w:w="100"/>
+            </w:tcMar>
+          </w:tcPr>
+          <w:p>
+            <w:r>
+              <w:rPr>
+                <w:sz w:val="22"/>
+                <w:szCs w:val="22"/>
+                <w:rFonts w:ascii="Times New Roman" w:cs="Times New Roman" w:eastAsia="Times New Roman" w:hAnsi="Times New Roman"/>
+              </w:rPr>
+              <w:t xml:space="preserve">Trước đây nằm ngoài 5 flow</w:t>
+            </w:r>
+          </w:p>
+        </w:tc>
+        <w:tc>
+          <w:tcPr>
+            <w:tcW w:type="pct" w:w="40%"/>
+            <w:tcBorders>
+              <w:top w:val="single" w:color="8EAADB" w:sz="4"/>
+              <w:left w:val="single" w:color="8EAADB" w:sz="4"/>
+              <w:bottom w:val="single" w:color="8EAADB" w:sz="4"/>
+              <w:right w:val="single" w:color="8EAADB" w:sz="4"/>
+            </w:tcBorders>
+            <w:tcMar>
+              <w:top w:type="dxa" w:w="60"/>
+              <w:left w:type="dxa" w:w="100"/>
+              <w:bottom w:type="dxa" w:w="60"/>
+              <w:right w:type="dxa" w:w="100"/>
+            </w:tcMar>
+          </w:tcPr>
+          <w:p>
+            <w:r>
+              <w:rPr>
+                <w:sz w:val="22"/>
+                <w:szCs w:val="22"/>
+                <w:rFonts w:ascii="Times New Roman" w:cs="Times New Roman" w:eastAsia="Times New Roman" w:hAnsi="Times New Roman"/>
+              </w:rPr>
+              <w:t xml:space="preserve">Đưa vào Flow 5 mới (F5-01 → F5-08)</w:t>
+            </w:r>
+          </w:p>
+        </w:tc>
+      </w:tr>
     </w:tbl>
     <w:p>
       <w:pPr>
@@ -6221,7 +7636,7 @@
           <w:szCs w:val="30"/>
           <w:rFonts w:ascii="Times New Roman" w:cs="Times New Roman" w:eastAsia="Times New Roman" w:hAnsi="Times New Roman"/>
         </w:rPr>
-        <w:t xml:space="preserve">5. Đề xuất chỉnh sửa các flow</w:t>
+        <w:t xml:space="preserve">6. Đề xuất chỉnh sửa các flow</w:t>
       </w:r>
     </w:p>
     <w:p>
@@ -6239,7 +7654,7 @@
           <w:szCs w:val="22"/>
           <w:rFonts w:ascii="Times New Roman" w:cs="Times New Roman" w:eastAsia="Times New Roman" w:hAnsi="Times New Roman"/>
         </w:rPr>
-        <w:t xml:space="preserve">Flow 1: đổi bước "Xác nhận phê duyệt &amp; gán chủ sở hữu" thành "Xác nhận phê duyệt &amp; cấp chuồng", vì chủ sở hữu đã được xác định từ lúc đăng ký.</w:t>
+        <w:t xml:space="preserve">Flow 1: đổi bước "Xác nhận phê duyệt &amp; gán chủ sở hữu" thành "Xác nhận phê duyệt &amp; cấp chuồng", vì chủ sở hữu đã được xác định từ lúc đăng ký. Thêm bước Club Manager phân công HLV phụ trách ngựa sau khi duyệt (F21-06).</w:t>
       </w:r>
     </w:p>
     <w:p>
@@ -6257,7 +7672,7 @@
           <w:szCs w:val="22"/>
           <w:rFonts w:ascii="Times New Roman" w:cs="Times New Roman" w:eastAsia="Times New Roman" w:hAnsi="Times New Roman"/>
         </w:rPr>
-        <w:t xml:space="preserve">Flow 2.1: đổi tên lane "Head Trainer" thành "Trainer", vì hệ thống chỉ có một vai trò huấn luyện viên.</w:t>
+        <w:t xml:space="preserve">Flow 2.1: đổi tên lane "Head Trainer" thành "Trainer". Sau bước lập giáo án, giáo án ở trạng thái Đang chờ; thêm bước Groom xác nhận buổi tập được phân công rồi mới chuyển Đang chạy (F21-07).</w:t>
       </w:r>
     </w:p>
     <w:p>
@@ -6275,7 +7690,25 @@
           <w:szCs w:val="22"/>
           <w:rFonts w:ascii="Times New Roman" w:cs="Times New Roman" w:eastAsia="Times New Roman" w:hAnsi="Times New Roman"/>
         </w:rPr>
-        <w:t xml:space="preserve">Flow 3: chuyển bước "Thẩm định kho dược phẩm" sang lane Warehouse Manager, và đổi "Quản lý duyệt phác đồ" thành "Bác sĩ xác nhận phương án kho" cho khớp với SRS.</w:t>
+        <w:t xml:space="preserve">Flow 2.2: thêm bước Groom xác nhận buổi tập trước khi thực hiện (F22-06).</w:t>
+      </w:r>
+    </w:p>
+    <w:p>
+      <w:pPr>
+        <w:pStyle w:val="ListParagraph"/>
+        <w:numPr>
+          <w:ilvl w:val="0"/>
+          <w:numId w:val="1"/>
+        </w:numPr>
+        <w:spacing w:after="60"/>
+      </w:pPr>
+      <w:r>
+        <w:rPr>
+          <w:sz w:val="22"/>
+          <w:szCs w:val="22"/>
+          <w:rFonts w:ascii="Times New Roman" w:cs="Times New Roman" w:eastAsia="Times New Roman" w:hAnsi="Times New Roman"/>
+        </w:rPr>
+        <w:t xml:space="preserve">Flow 3: chuyển bước "Thẩm định kho dược phẩm" sang lane Warehouse Manager; đổi "Quản lý duyệt phác đồ" thành "Bác sĩ xác nhận phương án kho". Thêm lane Horse Owner thanh toán hóa đơn từng giai đoạn trước ngày bắt đầu, nhánh tạm dừng khi chưa thanh toán và nhánh ngoại lệ ca cấp cứu (F3-07, F3-08).</w:t>
       </w:r>
     </w:p>
     <w:p>
@@ -6298,6 +7731,24 @@
     </w:p>
     <w:p>
       <w:pPr>
+        <w:pStyle w:val="ListParagraph"/>
+        <w:numPr>
+          <w:ilvl w:val="0"/>
+          <w:numId w:val="1"/>
+        </w:numPr>
+        <w:spacing w:after="60"/>
+      </w:pPr>
+      <w:r>
+        <w:rPr>
+          <w:sz w:val="22"/>
+          <w:szCs w:val="22"/>
+          <w:rFonts w:ascii="Times New Roman" w:cs="Times New Roman" w:eastAsia="Times New Roman" w:hAnsi="Times New Roman"/>
+        </w:rPr>
+        <w:t xml:space="preserve">Thêm Flow 5: Phát hành hóa đơn tháng → chủ ngựa thanh toán qua VNPay → server xác minh → quá hạn tính phí → đình chỉ (Club Manager) → thanh toán đủ → kích hoạt lại; báo cáo tài chính cho Club Manager.</w:t>
+      </w:r>
+    </w:p>
+    <w:p>
+      <w:pPr>
         <w:pStyle w:val="Heading1"/>
         <w:spacing w:before="240" w:after="120"/>
       </w:pPr>
@@ -6310,7 +7761,7 @@
           <w:szCs w:val="30"/>
           <w:rFonts w:ascii="Times New Roman" w:cs="Times New Roman" w:eastAsia="Times New Roman" w:hAnsi="Times New Roman"/>
         </w:rPr>
-        <w:t xml:space="preserve">6. Rule chưa áp dụng và việc cần làm</w:t>
+        <w:t xml:space="preserve">7. Rule chưa áp dụng đầy đủ và việc cần làm</w:t>
       </w:r>
     </w:p>
     <w:p>
@@ -6346,7 +7797,7 @@
           <w:szCs w:val="22"/>
           <w:rFonts w:ascii="Times New Roman" w:cs="Times New Roman" w:eastAsia="Times New Roman" w:hAnsi="Times New Roman"/>
         </w:rPr>
-        <w:t xml:space="preserve">F3-07, F3-08: cần module thanh toán theo giai đoạn phác đồ.</w:t>
+        <w:t xml:space="preserve">F5-05 (BR_15): cần trạng thái hợp đồng "đã chấm dứt" trong DB để tự động chấm dứt sau 60 ngày; hiện chỉ gắn cờ trong danh sách hóa đơn và báo cáo.</w:t>
       </w:r>
     </w:p>
     <w:p>
@@ -6364,7 +7815,7 @@
           <w:szCs w:val="22"/>
           <w:rFonts w:ascii="Times New Roman" w:cs="Times New Roman" w:eastAsia="Times New Roman" w:hAnsi="Times New Roman"/>
         </w:rPr>
-        <w:t xml:space="preserve">GEN-07: mở rộng Audit Log cho điều chỉnh tồn kho và thao tác phác đồ.</w:t>
+        <w:t xml:space="preserve">F5-08 (BR_11): cần quy tắc chia thưởng theo hợp đồng và luồng thi đấu thật.</w:t>
       </w:r>
     </w:p>
     <w:p>
@@ -6382,7 +7833,25 @@
           <w:szCs w:val="22"/>
           <w:rFonts w:ascii="Times New Roman" w:cs="Times New Roman" w:eastAsia="Times New Roman" w:hAnsi="Times New Roman"/>
         </w:rPr>
-        <w:t xml:space="preserve">BR_04, BR_11, BR_12 – BR_15: cần thêm flow thi đấu và flow tài chính.</w:t>
+        <w:t xml:space="preserve">GEN-07: mở rộng Audit Log cho điều chỉnh tồn kho.</w:t>
+      </w:r>
+    </w:p>
+    <w:p>
+      <w:pPr>
+        <w:pStyle w:val="ListParagraph"/>
+        <w:numPr>
+          <w:ilvl w:val="0"/>
+          <w:numId w:val="1"/>
+        </w:numPr>
+        <w:spacing w:after="60"/>
+      </w:pPr>
+      <w:r>
+        <w:rPr>
+          <w:sz w:val="22"/>
+          <w:szCs w:val="22"/>
+          <w:rFonts w:ascii="Times New Roman" w:cs="Times New Roman" w:eastAsia="Times New Roman" w:hAnsi="Times New Roman"/>
+        </w:rPr>
+        <w:t xml:space="preserve">BR_04: cần thêm flow thi đấu.</w:t>
       </w:r>
     </w:p>
     <w:sectPr>

</xml_diff>